<commit_message>
fix(violation): fix entrance slip generation and formatting
- Force server-side slip generation to avoid JS cache issues
- Improve XML replacement logic for better field spacing and readability
- Fix label regex to handle split XML tags in DOCX documents
- Adjust font sizes for better visibility of generated content
- Add administrator signature lines to slip template
</commit_message>
<xml_diff>
--- a/app/assets/SLIP.docx
+++ b/app/assets/SLIP.docx
@@ -87,8 +87,9 @@
     </w:p>
     <w:p>
       <w:pPr>
-        <w:pStyle w:val="4"/>
-        <w:jc w:val="center"/>
+        <w:pStyle w:val="6"/>
+        <w:ind w:left="1440" w:leftChars="0" w:firstLine="720" w:firstLineChars="0"/>
+        <w:jc w:val="both"/>
         <w:rPr>
           <w:rFonts w:ascii="Century Gothic" w:hAnsi="Century Gothic"/>
           <w:b/>
@@ -97,12 +98,7 @@
           <w:szCs w:val="15"/>
         </w:rPr>
       </w:pPr>
-    </w:p>
-    <w:p>
-      <w:pPr>
-        <w:pStyle w:val="4"/>
-        <w:ind w:left="1440" w:leftChars="0" w:firstLine="720" w:firstLineChars="0"/>
-        <w:jc w:val="both"/>
+      <w:r>
         <w:rPr>
           <w:rFonts w:ascii="Century Gothic" w:hAnsi="Century Gothic"/>
           <w:b/>
@@ -110,21 +106,12 @@
           <w:sz w:val="15"/>
           <w:szCs w:val="15"/>
         </w:rPr>
-      </w:pPr>
-      <w:r>
-        <w:rPr>
-          <w:rFonts w:ascii="Century Gothic" w:hAnsi="Century Gothic"/>
-          <w:b/>
-          <w:bCs/>
-          <w:sz w:val="15"/>
-          <w:szCs w:val="15"/>
-        </w:rPr>
         <w:t>ENTRANCE SLIP</w:t>
       </w:r>
     </w:p>
     <w:p>
       <w:pPr>
-        <w:pStyle w:val="4"/>
+        <w:pStyle w:val="6"/>
         <w:rPr>
           <w:rFonts w:ascii="Century Gothic" w:hAnsi="Century Gothic"/>
           <w:sz w:val="15"/>
@@ -134,7 +121,7 @@
     </w:p>
     <w:p>
       <w:pPr>
-        <w:pStyle w:val="4"/>
+        <w:pStyle w:val="6"/>
         <w:rPr>
           <w:rFonts w:ascii="Century Gothic" w:hAnsi="Century Gothic"/>
           <w:sz w:val="15"/>
@@ -169,7 +156,7 @@
     </w:p>
     <w:p>
       <w:pPr>
-        <w:pStyle w:val="4"/>
+        <w:pStyle w:val="6"/>
         <w:ind w:left="720" w:leftChars="0" w:firstLine="720" w:firstLineChars="0"/>
         <w:rPr>
           <w:rFonts w:ascii="Century Gothic" w:hAnsi="Century Gothic"/>
@@ -180,7 +167,7 @@
     </w:p>
     <w:p>
       <w:pPr>
-        <w:pStyle w:val="4"/>
+        <w:pStyle w:val="6"/>
         <w:rPr>
           <w:rFonts w:cstheme="minorHAnsi"/>
           <w:b/>
@@ -200,7 +187,7 @@
     </w:p>
     <w:p>
       <w:pPr>
-        <w:pStyle w:val="4"/>
+        <w:pStyle w:val="6"/>
         <w:rPr>
           <w:rFonts w:cstheme="minorHAnsi"/>
           <w:b/>
@@ -266,7 +253,7 @@
           </w:tcPr>
           <w:p>
             <w:pPr>
-              <w:pStyle w:val="4"/>
+              <w:pStyle w:val="6"/>
               <w:rPr>
                 <w:rFonts w:ascii="Century Gothic" w:hAnsi="Century Gothic"/>
                 <w:b/>
@@ -307,7 +294,7 @@
           </w:tcPr>
           <w:p>
             <w:pPr>
-              <w:pStyle w:val="4"/>
+              <w:pStyle w:val="6"/>
               <w:rPr>
                 <w:rFonts w:ascii="Century Gothic" w:hAnsi="Century Gothic"/>
                 <w:b/>
@@ -349,7 +336,7 @@
           </w:tcPr>
           <w:p>
             <w:pPr>
-              <w:pStyle w:val="4"/>
+              <w:pStyle w:val="6"/>
               <w:rPr>
                 <w:rFonts w:ascii="Century Gothic" w:hAnsi="Century Gothic"/>
                 <w:b/>
@@ -387,37 +374,37 @@
           </w:tcPr>
           <w:p>
             <w:pPr>
-              <w:pStyle w:val="4"/>
-              <w:rPr>
-                <w:rFonts w:ascii="Century Gothic" w:hAnsi="Century Gothic"/>
-                <w:b/>
-                <w:bCs/>
-                <w:sz w:val="15"/>
-                <w:szCs w:val="15"/>
-              </w:rPr>
-            </w:pPr>
-          </w:p>
-        </w:tc>
-        <w:tc>
-          <w:tcPr>
-            <w:tcW w:w="0" w:type="auto"/>
-            <w:tcBorders>
-              <w:top w:val="single" w:color="CCCCCC" w:sz="6" w:space="0"/>
-              <w:left w:val="single" w:color="CCCCCC" w:sz="6" w:space="0"/>
-              <w:bottom w:val="single" w:color="000000" w:sz="12" w:space="0"/>
-              <w:right w:val="single" w:color="000000" w:sz="12" w:space="0"/>
-            </w:tcBorders>
-            <w:tcMar>
-              <w:top w:w="30" w:type="dxa"/>
-              <w:left w:w="45" w:type="dxa"/>
-              <w:bottom w:w="30" w:type="dxa"/>
-              <w:right w:w="45" w:type="dxa"/>
-            </w:tcMar>
-            <w:vAlign w:val="center"/>
-          </w:tcPr>
-          <w:p>
-            <w:pPr>
-              <w:pStyle w:val="4"/>
+              <w:pStyle w:val="6"/>
+              <w:rPr>
+                <w:rFonts w:ascii="Century Gothic" w:hAnsi="Century Gothic"/>
+                <w:b/>
+                <w:bCs/>
+                <w:sz w:val="15"/>
+                <w:szCs w:val="15"/>
+              </w:rPr>
+            </w:pPr>
+          </w:p>
+        </w:tc>
+        <w:tc>
+          <w:tcPr>
+            <w:tcW w:w="0" w:type="auto"/>
+            <w:tcBorders>
+              <w:top w:val="single" w:color="CCCCCC" w:sz="6" w:space="0"/>
+              <w:left w:val="single" w:color="CCCCCC" w:sz="6" w:space="0"/>
+              <w:bottom w:val="single" w:color="000000" w:sz="12" w:space="0"/>
+              <w:right w:val="single" w:color="000000" w:sz="12" w:space="0"/>
+            </w:tcBorders>
+            <w:tcMar>
+              <w:top w:w="30" w:type="dxa"/>
+              <w:left w:w="45" w:type="dxa"/>
+              <w:bottom w:w="30" w:type="dxa"/>
+              <w:right w:w="45" w:type="dxa"/>
+            </w:tcMar>
+            <w:vAlign w:val="center"/>
+          </w:tcPr>
+          <w:p>
+            <w:pPr>
+              <w:pStyle w:val="6"/>
               <w:jc w:val="center"/>
               <w:rPr>
                 <w:rFonts w:ascii="Century Gothic" w:hAnsi="Century Gothic"/>
@@ -458,7 +445,7 @@
           </w:tcPr>
           <w:p>
             <w:pPr>
-              <w:pStyle w:val="4"/>
+              <w:pStyle w:val="6"/>
               <w:jc w:val="center"/>
               <w:rPr>
                 <w:rFonts w:ascii="Century Gothic" w:hAnsi="Century Gothic"/>
@@ -499,7 +486,7 @@
           </w:tcPr>
           <w:p>
             <w:pPr>
-              <w:pStyle w:val="4"/>
+              <w:pStyle w:val="6"/>
               <w:jc w:val="center"/>
               <w:rPr>
                 <w:rFonts w:ascii="Century Gothic" w:hAnsi="Century Gothic"/>
@@ -540,7 +527,7 @@
           </w:tcPr>
           <w:p>
             <w:pPr>
-              <w:pStyle w:val="4"/>
+              <w:pStyle w:val="6"/>
               <w:jc w:val="center"/>
               <w:rPr>
                 <w:rFonts w:ascii="Century Gothic" w:hAnsi="Century Gothic"/>
@@ -581,7 +568,7 @@
           </w:tcPr>
           <w:p>
             <w:pPr>
-              <w:pStyle w:val="4"/>
+              <w:pStyle w:val="6"/>
               <w:jc w:val="center"/>
               <w:rPr>
                 <w:rFonts w:ascii="Century Gothic" w:hAnsi="Century Gothic"/>
@@ -635,7 +622,7 @@
           </w:tcPr>
           <w:p>
             <w:pPr>
-              <w:pStyle w:val="4"/>
+              <w:pStyle w:val="6"/>
               <w:rPr>
                 <w:rFonts w:ascii="Century Gothic" w:hAnsi="Century Gothic"/>
                 <w:b/>
@@ -675,121 +662,121 @@
           </w:tcPr>
           <w:p>
             <w:pPr>
-              <w:pStyle w:val="4"/>
-              <w:rPr>
-                <w:rFonts w:ascii="Century Gothic" w:hAnsi="Century Gothic"/>
-                <w:b/>
-                <w:bCs/>
-                <w:sz w:val="15"/>
-                <w:szCs w:val="15"/>
-              </w:rPr>
-            </w:pPr>
-          </w:p>
-        </w:tc>
-        <w:tc>
-          <w:tcPr>
-            <w:tcW w:w="0" w:type="auto"/>
-            <w:tcBorders>
-              <w:top w:val="single" w:color="CCCCCC" w:sz="6" w:space="0"/>
-              <w:left w:val="single" w:color="CCCCCC" w:sz="6" w:space="0"/>
-              <w:bottom w:val="single" w:color="000000" w:sz="12" w:space="0"/>
-              <w:right w:val="single" w:color="000000" w:sz="12" w:space="0"/>
-            </w:tcBorders>
-            <w:tcMar>
-              <w:top w:w="30" w:type="dxa"/>
-              <w:left w:w="45" w:type="dxa"/>
-              <w:bottom w:w="30" w:type="dxa"/>
-              <w:right w:w="45" w:type="dxa"/>
-            </w:tcMar>
-            <w:vAlign w:val="center"/>
-          </w:tcPr>
-          <w:p>
-            <w:pPr>
-              <w:pStyle w:val="4"/>
-              <w:rPr>
-                <w:rFonts w:ascii="Century Gothic" w:hAnsi="Century Gothic"/>
-                <w:sz w:val="15"/>
-                <w:szCs w:val="15"/>
-              </w:rPr>
-            </w:pPr>
-          </w:p>
-        </w:tc>
-        <w:tc>
-          <w:tcPr>
-            <w:tcW w:w="0" w:type="auto"/>
-            <w:tcBorders>
-              <w:top w:val="single" w:color="CCCCCC" w:sz="6" w:space="0"/>
-              <w:left w:val="single" w:color="CCCCCC" w:sz="6" w:space="0"/>
-              <w:bottom w:val="single" w:color="000000" w:sz="12" w:space="0"/>
-              <w:right w:val="single" w:color="000000" w:sz="12" w:space="0"/>
-            </w:tcBorders>
-            <w:tcMar>
-              <w:top w:w="30" w:type="dxa"/>
-              <w:left w:w="45" w:type="dxa"/>
-              <w:bottom w:w="30" w:type="dxa"/>
-              <w:right w:w="45" w:type="dxa"/>
-            </w:tcMar>
-            <w:vAlign w:val="center"/>
-          </w:tcPr>
-          <w:p>
-            <w:pPr>
-              <w:pStyle w:val="4"/>
-              <w:rPr>
-                <w:rFonts w:ascii="Century Gothic" w:hAnsi="Century Gothic"/>
-                <w:sz w:val="15"/>
-                <w:szCs w:val="15"/>
-              </w:rPr>
-            </w:pPr>
-          </w:p>
-        </w:tc>
-        <w:tc>
-          <w:tcPr>
-            <w:tcW w:w="0" w:type="auto"/>
-            <w:tcBorders>
-              <w:top w:val="single" w:color="CCCCCC" w:sz="6" w:space="0"/>
-              <w:left w:val="single" w:color="CCCCCC" w:sz="6" w:space="0"/>
-              <w:bottom w:val="single" w:color="000000" w:sz="12" w:space="0"/>
-              <w:right w:val="single" w:color="000000" w:sz="12" w:space="0"/>
-            </w:tcBorders>
-            <w:tcMar>
-              <w:top w:w="30" w:type="dxa"/>
-              <w:left w:w="45" w:type="dxa"/>
-              <w:bottom w:w="30" w:type="dxa"/>
-              <w:right w:w="45" w:type="dxa"/>
-            </w:tcMar>
-            <w:vAlign w:val="center"/>
-          </w:tcPr>
-          <w:p>
-            <w:pPr>
-              <w:pStyle w:val="4"/>
-              <w:rPr>
-                <w:rFonts w:ascii="Century Gothic" w:hAnsi="Century Gothic"/>
-                <w:sz w:val="15"/>
-                <w:szCs w:val="15"/>
-              </w:rPr>
-            </w:pPr>
-          </w:p>
-        </w:tc>
-        <w:tc>
-          <w:tcPr>
-            <w:tcW w:w="0" w:type="auto"/>
-            <w:tcBorders>
-              <w:top w:val="single" w:color="CCCCCC" w:sz="6" w:space="0"/>
-              <w:left w:val="single" w:color="CCCCCC" w:sz="6" w:space="0"/>
-              <w:bottom w:val="single" w:color="000000" w:sz="12" w:space="0"/>
-              <w:right w:val="single" w:color="000000" w:sz="12" w:space="0"/>
-            </w:tcBorders>
-            <w:tcMar>
-              <w:top w:w="30" w:type="dxa"/>
-              <w:left w:w="45" w:type="dxa"/>
-              <w:bottom w:w="30" w:type="dxa"/>
-              <w:right w:w="45" w:type="dxa"/>
-            </w:tcMar>
-            <w:vAlign w:val="center"/>
-          </w:tcPr>
-          <w:p>
-            <w:pPr>
-              <w:pStyle w:val="4"/>
+              <w:pStyle w:val="6"/>
+              <w:rPr>
+                <w:rFonts w:ascii="Century Gothic" w:hAnsi="Century Gothic"/>
+                <w:b/>
+                <w:bCs/>
+                <w:sz w:val="15"/>
+                <w:szCs w:val="15"/>
+              </w:rPr>
+            </w:pPr>
+          </w:p>
+        </w:tc>
+        <w:tc>
+          <w:tcPr>
+            <w:tcW w:w="0" w:type="auto"/>
+            <w:tcBorders>
+              <w:top w:val="single" w:color="CCCCCC" w:sz="6" w:space="0"/>
+              <w:left w:val="single" w:color="CCCCCC" w:sz="6" w:space="0"/>
+              <w:bottom w:val="single" w:color="000000" w:sz="12" w:space="0"/>
+              <w:right w:val="single" w:color="000000" w:sz="12" w:space="0"/>
+            </w:tcBorders>
+            <w:tcMar>
+              <w:top w:w="30" w:type="dxa"/>
+              <w:left w:w="45" w:type="dxa"/>
+              <w:bottom w:w="30" w:type="dxa"/>
+              <w:right w:w="45" w:type="dxa"/>
+            </w:tcMar>
+            <w:vAlign w:val="center"/>
+          </w:tcPr>
+          <w:p>
+            <w:pPr>
+              <w:pStyle w:val="6"/>
+              <w:rPr>
+                <w:rFonts w:ascii="Century Gothic" w:hAnsi="Century Gothic"/>
+                <w:sz w:val="15"/>
+                <w:szCs w:val="15"/>
+              </w:rPr>
+            </w:pPr>
+          </w:p>
+        </w:tc>
+        <w:tc>
+          <w:tcPr>
+            <w:tcW w:w="0" w:type="auto"/>
+            <w:tcBorders>
+              <w:top w:val="single" w:color="CCCCCC" w:sz="6" w:space="0"/>
+              <w:left w:val="single" w:color="CCCCCC" w:sz="6" w:space="0"/>
+              <w:bottom w:val="single" w:color="000000" w:sz="12" w:space="0"/>
+              <w:right w:val="single" w:color="000000" w:sz="12" w:space="0"/>
+            </w:tcBorders>
+            <w:tcMar>
+              <w:top w:w="30" w:type="dxa"/>
+              <w:left w:w="45" w:type="dxa"/>
+              <w:bottom w:w="30" w:type="dxa"/>
+              <w:right w:w="45" w:type="dxa"/>
+            </w:tcMar>
+            <w:vAlign w:val="center"/>
+          </w:tcPr>
+          <w:p>
+            <w:pPr>
+              <w:pStyle w:val="6"/>
+              <w:rPr>
+                <w:rFonts w:ascii="Century Gothic" w:hAnsi="Century Gothic"/>
+                <w:sz w:val="15"/>
+                <w:szCs w:val="15"/>
+              </w:rPr>
+            </w:pPr>
+          </w:p>
+        </w:tc>
+        <w:tc>
+          <w:tcPr>
+            <w:tcW w:w="0" w:type="auto"/>
+            <w:tcBorders>
+              <w:top w:val="single" w:color="CCCCCC" w:sz="6" w:space="0"/>
+              <w:left w:val="single" w:color="CCCCCC" w:sz="6" w:space="0"/>
+              <w:bottom w:val="single" w:color="000000" w:sz="12" w:space="0"/>
+              <w:right w:val="single" w:color="000000" w:sz="12" w:space="0"/>
+            </w:tcBorders>
+            <w:tcMar>
+              <w:top w:w="30" w:type="dxa"/>
+              <w:left w:w="45" w:type="dxa"/>
+              <w:bottom w:w="30" w:type="dxa"/>
+              <w:right w:w="45" w:type="dxa"/>
+            </w:tcMar>
+            <w:vAlign w:val="center"/>
+          </w:tcPr>
+          <w:p>
+            <w:pPr>
+              <w:pStyle w:val="6"/>
+              <w:rPr>
+                <w:rFonts w:ascii="Century Gothic" w:hAnsi="Century Gothic"/>
+                <w:sz w:val="15"/>
+                <w:szCs w:val="15"/>
+              </w:rPr>
+            </w:pPr>
+          </w:p>
+        </w:tc>
+        <w:tc>
+          <w:tcPr>
+            <w:tcW w:w="0" w:type="auto"/>
+            <w:tcBorders>
+              <w:top w:val="single" w:color="CCCCCC" w:sz="6" w:space="0"/>
+              <w:left w:val="single" w:color="CCCCCC" w:sz="6" w:space="0"/>
+              <w:bottom w:val="single" w:color="000000" w:sz="12" w:space="0"/>
+              <w:right w:val="single" w:color="000000" w:sz="12" w:space="0"/>
+            </w:tcBorders>
+            <w:tcMar>
+              <w:top w:w="30" w:type="dxa"/>
+              <w:left w:w="45" w:type="dxa"/>
+              <w:bottom w:w="30" w:type="dxa"/>
+              <w:right w:w="45" w:type="dxa"/>
+            </w:tcMar>
+            <w:vAlign w:val="center"/>
+          </w:tcPr>
+          <w:p>
+            <w:pPr>
+              <w:pStyle w:val="6"/>
               <w:rPr>
                 <w:rFonts w:ascii="Century Gothic" w:hAnsi="Century Gothic"/>
                 <w:sz w:val="15"/>
@@ -830,7 +817,7 @@
           </w:tcPr>
           <w:p>
             <w:pPr>
-              <w:pStyle w:val="4"/>
+              <w:pStyle w:val="6"/>
               <w:rPr>
                 <w:rFonts w:ascii="Century Gothic" w:hAnsi="Century Gothic"/>
                 <w:b/>
@@ -870,121 +857,121 @@
           </w:tcPr>
           <w:p>
             <w:pPr>
-              <w:pStyle w:val="4"/>
-              <w:rPr>
-                <w:rFonts w:ascii="Century Gothic" w:hAnsi="Century Gothic"/>
-                <w:b/>
-                <w:bCs/>
-                <w:sz w:val="15"/>
-                <w:szCs w:val="15"/>
-              </w:rPr>
-            </w:pPr>
-          </w:p>
-        </w:tc>
-        <w:tc>
-          <w:tcPr>
-            <w:tcW w:w="0" w:type="auto"/>
-            <w:tcBorders>
-              <w:top w:val="single" w:color="CCCCCC" w:sz="6" w:space="0"/>
-              <w:left w:val="single" w:color="CCCCCC" w:sz="6" w:space="0"/>
-              <w:bottom w:val="single" w:color="000000" w:sz="12" w:space="0"/>
-              <w:right w:val="single" w:color="000000" w:sz="12" w:space="0"/>
-            </w:tcBorders>
-            <w:tcMar>
-              <w:top w:w="30" w:type="dxa"/>
-              <w:left w:w="45" w:type="dxa"/>
-              <w:bottom w:w="30" w:type="dxa"/>
-              <w:right w:w="45" w:type="dxa"/>
-            </w:tcMar>
-            <w:vAlign w:val="center"/>
-          </w:tcPr>
-          <w:p>
-            <w:pPr>
-              <w:pStyle w:val="4"/>
-              <w:rPr>
-                <w:rFonts w:ascii="Century Gothic" w:hAnsi="Century Gothic"/>
-                <w:sz w:val="15"/>
-                <w:szCs w:val="15"/>
-              </w:rPr>
-            </w:pPr>
-          </w:p>
-        </w:tc>
-        <w:tc>
-          <w:tcPr>
-            <w:tcW w:w="0" w:type="auto"/>
-            <w:tcBorders>
-              <w:top w:val="single" w:color="CCCCCC" w:sz="6" w:space="0"/>
-              <w:left w:val="single" w:color="CCCCCC" w:sz="6" w:space="0"/>
-              <w:bottom w:val="single" w:color="000000" w:sz="12" w:space="0"/>
-              <w:right w:val="single" w:color="000000" w:sz="12" w:space="0"/>
-            </w:tcBorders>
-            <w:tcMar>
-              <w:top w:w="30" w:type="dxa"/>
-              <w:left w:w="45" w:type="dxa"/>
-              <w:bottom w:w="30" w:type="dxa"/>
-              <w:right w:w="45" w:type="dxa"/>
-            </w:tcMar>
-            <w:vAlign w:val="center"/>
-          </w:tcPr>
-          <w:p>
-            <w:pPr>
-              <w:pStyle w:val="4"/>
-              <w:rPr>
-                <w:rFonts w:ascii="Century Gothic" w:hAnsi="Century Gothic"/>
-                <w:sz w:val="15"/>
-                <w:szCs w:val="15"/>
-              </w:rPr>
-            </w:pPr>
-          </w:p>
-        </w:tc>
-        <w:tc>
-          <w:tcPr>
-            <w:tcW w:w="0" w:type="auto"/>
-            <w:tcBorders>
-              <w:top w:val="single" w:color="CCCCCC" w:sz="6" w:space="0"/>
-              <w:left w:val="single" w:color="CCCCCC" w:sz="6" w:space="0"/>
-              <w:bottom w:val="single" w:color="000000" w:sz="12" w:space="0"/>
-              <w:right w:val="single" w:color="000000" w:sz="12" w:space="0"/>
-            </w:tcBorders>
-            <w:tcMar>
-              <w:top w:w="30" w:type="dxa"/>
-              <w:left w:w="45" w:type="dxa"/>
-              <w:bottom w:w="30" w:type="dxa"/>
-              <w:right w:w="45" w:type="dxa"/>
-            </w:tcMar>
-            <w:vAlign w:val="center"/>
-          </w:tcPr>
-          <w:p>
-            <w:pPr>
-              <w:pStyle w:val="4"/>
-              <w:rPr>
-                <w:rFonts w:ascii="Century Gothic" w:hAnsi="Century Gothic"/>
-                <w:sz w:val="15"/>
-                <w:szCs w:val="15"/>
-              </w:rPr>
-            </w:pPr>
-          </w:p>
-        </w:tc>
-        <w:tc>
-          <w:tcPr>
-            <w:tcW w:w="0" w:type="auto"/>
-            <w:tcBorders>
-              <w:top w:val="single" w:color="CCCCCC" w:sz="6" w:space="0"/>
-              <w:left w:val="single" w:color="CCCCCC" w:sz="6" w:space="0"/>
-              <w:bottom w:val="single" w:color="000000" w:sz="12" w:space="0"/>
-              <w:right w:val="single" w:color="000000" w:sz="12" w:space="0"/>
-            </w:tcBorders>
-            <w:tcMar>
-              <w:top w:w="30" w:type="dxa"/>
-              <w:left w:w="45" w:type="dxa"/>
-              <w:bottom w:w="30" w:type="dxa"/>
-              <w:right w:w="45" w:type="dxa"/>
-            </w:tcMar>
-            <w:vAlign w:val="center"/>
-          </w:tcPr>
-          <w:p>
-            <w:pPr>
-              <w:pStyle w:val="4"/>
+              <w:pStyle w:val="6"/>
+              <w:rPr>
+                <w:rFonts w:ascii="Century Gothic" w:hAnsi="Century Gothic"/>
+                <w:b/>
+                <w:bCs/>
+                <w:sz w:val="15"/>
+                <w:szCs w:val="15"/>
+              </w:rPr>
+            </w:pPr>
+          </w:p>
+        </w:tc>
+        <w:tc>
+          <w:tcPr>
+            <w:tcW w:w="0" w:type="auto"/>
+            <w:tcBorders>
+              <w:top w:val="single" w:color="CCCCCC" w:sz="6" w:space="0"/>
+              <w:left w:val="single" w:color="CCCCCC" w:sz="6" w:space="0"/>
+              <w:bottom w:val="single" w:color="000000" w:sz="12" w:space="0"/>
+              <w:right w:val="single" w:color="000000" w:sz="12" w:space="0"/>
+            </w:tcBorders>
+            <w:tcMar>
+              <w:top w:w="30" w:type="dxa"/>
+              <w:left w:w="45" w:type="dxa"/>
+              <w:bottom w:w="30" w:type="dxa"/>
+              <w:right w:w="45" w:type="dxa"/>
+            </w:tcMar>
+            <w:vAlign w:val="center"/>
+          </w:tcPr>
+          <w:p>
+            <w:pPr>
+              <w:pStyle w:val="6"/>
+              <w:rPr>
+                <w:rFonts w:ascii="Century Gothic" w:hAnsi="Century Gothic"/>
+                <w:sz w:val="15"/>
+                <w:szCs w:val="15"/>
+              </w:rPr>
+            </w:pPr>
+          </w:p>
+        </w:tc>
+        <w:tc>
+          <w:tcPr>
+            <w:tcW w:w="0" w:type="auto"/>
+            <w:tcBorders>
+              <w:top w:val="single" w:color="CCCCCC" w:sz="6" w:space="0"/>
+              <w:left w:val="single" w:color="CCCCCC" w:sz="6" w:space="0"/>
+              <w:bottom w:val="single" w:color="000000" w:sz="12" w:space="0"/>
+              <w:right w:val="single" w:color="000000" w:sz="12" w:space="0"/>
+            </w:tcBorders>
+            <w:tcMar>
+              <w:top w:w="30" w:type="dxa"/>
+              <w:left w:w="45" w:type="dxa"/>
+              <w:bottom w:w="30" w:type="dxa"/>
+              <w:right w:w="45" w:type="dxa"/>
+            </w:tcMar>
+            <w:vAlign w:val="center"/>
+          </w:tcPr>
+          <w:p>
+            <w:pPr>
+              <w:pStyle w:val="6"/>
+              <w:rPr>
+                <w:rFonts w:ascii="Century Gothic" w:hAnsi="Century Gothic"/>
+                <w:sz w:val="15"/>
+                <w:szCs w:val="15"/>
+              </w:rPr>
+            </w:pPr>
+          </w:p>
+        </w:tc>
+        <w:tc>
+          <w:tcPr>
+            <w:tcW w:w="0" w:type="auto"/>
+            <w:tcBorders>
+              <w:top w:val="single" w:color="CCCCCC" w:sz="6" w:space="0"/>
+              <w:left w:val="single" w:color="CCCCCC" w:sz="6" w:space="0"/>
+              <w:bottom w:val="single" w:color="000000" w:sz="12" w:space="0"/>
+              <w:right w:val="single" w:color="000000" w:sz="12" w:space="0"/>
+            </w:tcBorders>
+            <w:tcMar>
+              <w:top w:w="30" w:type="dxa"/>
+              <w:left w:w="45" w:type="dxa"/>
+              <w:bottom w:w="30" w:type="dxa"/>
+              <w:right w:w="45" w:type="dxa"/>
+            </w:tcMar>
+            <w:vAlign w:val="center"/>
+          </w:tcPr>
+          <w:p>
+            <w:pPr>
+              <w:pStyle w:val="6"/>
+              <w:rPr>
+                <w:rFonts w:ascii="Century Gothic" w:hAnsi="Century Gothic"/>
+                <w:sz w:val="15"/>
+                <w:szCs w:val="15"/>
+              </w:rPr>
+            </w:pPr>
+          </w:p>
+        </w:tc>
+        <w:tc>
+          <w:tcPr>
+            <w:tcW w:w="0" w:type="auto"/>
+            <w:tcBorders>
+              <w:top w:val="single" w:color="CCCCCC" w:sz="6" w:space="0"/>
+              <w:left w:val="single" w:color="CCCCCC" w:sz="6" w:space="0"/>
+              <w:bottom w:val="single" w:color="000000" w:sz="12" w:space="0"/>
+              <w:right w:val="single" w:color="000000" w:sz="12" w:space="0"/>
+            </w:tcBorders>
+            <w:tcMar>
+              <w:top w:w="30" w:type="dxa"/>
+              <w:left w:w="45" w:type="dxa"/>
+              <w:bottom w:w="30" w:type="dxa"/>
+              <w:right w:w="45" w:type="dxa"/>
+            </w:tcMar>
+            <w:vAlign w:val="center"/>
+          </w:tcPr>
+          <w:p>
+            <w:pPr>
+              <w:pStyle w:val="6"/>
               <w:rPr>
                 <w:rFonts w:ascii="Century Gothic" w:hAnsi="Century Gothic"/>
                 <w:sz w:val="15"/>
@@ -1025,7 +1012,7 @@
           </w:tcPr>
           <w:p>
             <w:pPr>
-              <w:pStyle w:val="4"/>
+              <w:pStyle w:val="6"/>
               <w:rPr>
                 <w:rFonts w:ascii="Century Gothic" w:hAnsi="Century Gothic"/>
                 <w:b/>
@@ -1065,121 +1052,121 @@
           </w:tcPr>
           <w:p>
             <w:pPr>
-              <w:pStyle w:val="4"/>
-              <w:rPr>
-                <w:rFonts w:ascii="Century Gothic" w:hAnsi="Century Gothic"/>
-                <w:b/>
-                <w:bCs/>
-                <w:sz w:val="15"/>
-                <w:szCs w:val="15"/>
-              </w:rPr>
-            </w:pPr>
-          </w:p>
-        </w:tc>
-        <w:tc>
-          <w:tcPr>
-            <w:tcW w:w="0" w:type="auto"/>
-            <w:tcBorders>
-              <w:top w:val="single" w:color="CCCCCC" w:sz="6" w:space="0"/>
-              <w:left w:val="single" w:color="CCCCCC" w:sz="6" w:space="0"/>
-              <w:bottom w:val="single" w:color="000000" w:sz="12" w:space="0"/>
-              <w:right w:val="single" w:color="000000" w:sz="12" w:space="0"/>
-            </w:tcBorders>
-            <w:tcMar>
-              <w:top w:w="30" w:type="dxa"/>
-              <w:left w:w="45" w:type="dxa"/>
-              <w:bottom w:w="30" w:type="dxa"/>
-              <w:right w:w="45" w:type="dxa"/>
-            </w:tcMar>
-            <w:vAlign w:val="center"/>
-          </w:tcPr>
-          <w:p>
-            <w:pPr>
-              <w:pStyle w:val="4"/>
-              <w:rPr>
-                <w:rFonts w:ascii="Century Gothic" w:hAnsi="Century Gothic"/>
-                <w:sz w:val="15"/>
-                <w:szCs w:val="15"/>
-              </w:rPr>
-            </w:pPr>
-          </w:p>
-        </w:tc>
-        <w:tc>
-          <w:tcPr>
-            <w:tcW w:w="0" w:type="auto"/>
-            <w:tcBorders>
-              <w:top w:val="single" w:color="CCCCCC" w:sz="6" w:space="0"/>
-              <w:left w:val="single" w:color="CCCCCC" w:sz="6" w:space="0"/>
-              <w:bottom w:val="single" w:color="000000" w:sz="12" w:space="0"/>
-              <w:right w:val="single" w:color="000000" w:sz="12" w:space="0"/>
-            </w:tcBorders>
-            <w:tcMar>
-              <w:top w:w="30" w:type="dxa"/>
-              <w:left w:w="45" w:type="dxa"/>
-              <w:bottom w:w="30" w:type="dxa"/>
-              <w:right w:w="45" w:type="dxa"/>
-            </w:tcMar>
-            <w:vAlign w:val="center"/>
-          </w:tcPr>
-          <w:p>
-            <w:pPr>
-              <w:pStyle w:val="4"/>
-              <w:rPr>
-                <w:rFonts w:ascii="Century Gothic" w:hAnsi="Century Gothic"/>
-                <w:sz w:val="15"/>
-                <w:szCs w:val="15"/>
-              </w:rPr>
-            </w:pPr>
-          </w:p>
-        </w:tc>
-        <w:tc>
-          <w:tcPr>
-            <w:tcW w:w="0" w:type="auto"/>
-            <w:tcBorders>
-              <w:top w:val="single" w:color="CCCCCC" w:sz="6" w:space="0"/>
-              <w:left w:val="single" w:color="CCCCCC" w:sz="6" w:space="0"/>
-              <w:bottom w:val="single" w:color="000000" w:sz="12" w:space="0"/>
-              <w:right w:val="single" w:color="000000" w:sz="12" w:space="0"/>
-            </w:tcBorders>
-            <w:tcMar>
-              <w:top w:w="30" w:type="dxa"/>
-              <w:left w:w="45" w:type="dxa"/>
-              <w:bottom w:w="30" w:type="dxa"/>
-              <w:right w:w="45" w:type="dxa"/>
-            </w:tcMar>
-            <w:vAlign w:val="center"/>
-          </w:tcPr>
-          <w:p>
-            <w:pPr>
-              <w:pStyle w:val="4"/>
-              <w:rPr>
-                <w:rFonts w:ascii="Century Gothic" w:hAnsi="Century Gothic"/>
-                <w:sz w:val="15"/>
-                <w:szCs w:val="15"/>
-              </w:rPr>
-            </w:pPr>
-          </w:p>
-        </w:tc>
-        <w:tc>
-          <w:tcPr>
-            <w:tcW w:w="0" w:type="auto"/>
-            <w:tcBorders>
-              <w:top w:val="single" w:color="CCCCCC" w:sz="6" w:space="0"/>
-              <w:left w:val="single" w:color="CCCCCC" w:sz="6" w:space="0"/>
-              <w:bottom w:val="single" w:color="000000" w:sz="12" w:space="0"/>
-              <w:right w:val="single" w:color="000000" w:sz="12" w:space="0"/>
-            </w:tcBorders>
-            <w:tcMar>
-              <w:top w:w="30" w:type="dxa"/>
-              <w:left w:w="45" w:type="dxa"/>
-              <w:bottom w:w="30" w:type="dxa"/>
-              <w:right w:w="45" w:type="dxa"/>
-            </w:tcMar>
-            <w:vAlign w:val="center"/>
-          </w:tcPr>
-          <w:p>
-            <w:pPr>
-              <w:pStyle w:val="4"/>
+              <w:pStyle w:val="6"/>
+              <w:rPr>
+                <w:rFonts w:ascii="Century Gothic" w:hAnsi="Century Gothic"/>
+                <w:b/>
+                <w:bCs/>
+                <w:sz w:val="15"/>
+                <w:szCs w:val="15"/>
+              </w:rPr>
+            </w:pPr>
+          </w:p>
+        </w:tc>
+        <w:tc>
+          <w:tcPr>
+            <w:tcW w:w="0" w:type="auto"/>
+            <w:tcBorders>
+              <w:top w:val="single" w:color="CCCCCC" w:sz="6" w:space="0"/>
+              <w:left w:val="single" w:color="CCCCCC" w:sz="6" w:space="0"/>
+              <w:bottom w:val="single" w:color="000000" w:sz="12" w:space="0"/>
+              <w:right w:val="single" w:color="000000" w:sz="12" w:space="0"/>
+            </w:tcBorders>
+            <w:tcMar>
+              <w:top w:w="30" w:type="dxa"/>
+              <w:left w:w="45" w:type="dxa"/>
+              <w:bottom w:w="30" w:type="dxa"/>
+              <w:right w:w="45" w:type="dxa"/>
+            </w:tcMar>
+            <w:vAlign w:val="center"/>
+          </w:tcPr>
+          <w:p>
+            <w:pPr>
+              <w:pStyle w:val="6"/>
+              <w:rPr>
+                <w:rFonts w:ascii="Century Gothic" w:hAnsi="Century Gothic"/>
+                <w:sz w:val="15"/>
+                <w:szCs w:val="15"/>
+              </w:rPr>
+            </w:pPr>
+          </w:p>
+        </w:tc>
+        <w:tc>
+          <w:tcPr>
+            <w:tcW w:w="0" w:type="auto"/>
+            <w:tcBorders>
+              <w:top w:val="single" w:color="CCCCCC" w:sz="6" w:space="0"/>
+              <w:left w:val="single" w:color="CCCCCC" w:sz="6" w:space="0"/>
+              <w:bottom w:val="single" w:color="000000" w:sz="12" w:space="0"/>
+              <w:right w:val="single" w:color="000000" w:sz="12" w:space="0"/>
+            </w:tcBorders>
+            <w:tcMar>
+              <w:top w:w="30" w:type="dxa"/>
+              <w:left w:w="45" w:type="dxa"/>
+              <w:bottom w:w="30" w:type="dxa"/>
+              <w:right w:w="45" w:type="dxa"/>
+            </w:tcMar>
+            <w:vAlign w:val="center"/>
+          </w:tcPr>
+          <w:p>
+            <w:pPr>
+              <w:pStyle w:val="6"/>
+              <w:rPr>
+                <w:rFonts w:ascii="Century Gothic" w:hAnsi="Century Gothic"/>
+                <w:sz w:val="15"/>
+                <w:szCs w:val="15"/>
+              </w:rPr>
+            </w:pPr>
+          </w:p>
+        </w:tc>
+        <w:tc>
+          <w:tcPr>
+            <w:tcW w:w="0" w:type="auto"/>
+            <w:tcBorders>
+              <w:top w:val="single" w:color="CCCCCC" w:sz="6" w:space="0"/>
+              <w:left w:val="single" w:color="CCCCCC" w:sz="6" w:space="0"/>
+              <w:bottom w:val="single" w:color="000000" w:sz="12" w:space="0"/>
+              <w:right w:val="single" w:color="000000" w:sz="12" w:space="0"/>
+            </w:tcBorders>
+            <w:tcMar>
+              <w:top w:w="30" w:type="dxa"/>
+              <w:left w:w="45" w:type="dxa"/>
+              <w:bottom w:w="30" w:type="dxa"/>
+              <w:right w:w="45" w:type="dxa"/>
+            </w:tcMar>
+            <w:vAlign w:val="center"/>
+          </w:tcPr>
+          <w:p>
+            <w:pPr>
+              <w:pStyle w:val="6"/>
+              <w:rPr>
+                <w:rFonts w:ascii="Century Gothic" w:hAnsi="Century Gothic"/>
+                <w:sz w:val="15"/>
+                <w:szCs w:val="15"/>
+              </w:rPr>
+            </w:pPr>
+          </w:p>
+        </w:tc>
+        <w:tc>
+          <w:tcPr>
+            <w:tcW w:w="0" w:type="auto"/>
+            <w:tcBorders>
+              <w:top w:val="single" w:color="CCCCCC" w:sz="6" w:space="0"/>
+              <w:left w:val="single" w:color="CCCCCC" w:sz="6" w:space="0"/>
+              <w:bottom w:val="single" w:color="000000" w:sz="12" w:space="0"/>
+              <w:right w:val="single" w:color="000000" w:sz="12" w:space="0"/>
+            </w:tcBorders>
+            <w:tcMar>
+              <w:top w:w="30" w:type="dxa"/>
+              <w:left w:w="45" w:type="dxa"/>
+              <w:bottom w:w="30" w:type="dxa"/>
+              <w:right w:w="45" w:type="dxa"/>
+            </w:tcMar>
+            <w:vAlign w:val="center"/>
+          </w:tcPr>
+          <w:p>
+            <w:pPr>
+              <w:pStyle w:val="6"/>
               <w:rPr>
                 <w:rFonts w:ascii="Century Gothic" w:hAnsi="Century Gothic"/>
                 <w:sz w:val="15"/>
@@ -1192,7 +1179,7 @@
     </w:tbl>
     <w:p>
       <w:pPr>
-        <w:pStyle w:val="4"/>
+        <w:pStyle w:val="6"/>
         <w:rPr>
           <w:rFonts w:hint="default" w:cstheme="minorHAnsi"/>
           <w:b/>
@@ -1205,7 +1192,7 @@
     </w:p>
     <w:p>
       <w:pPr>
-        <w:pStyle w:val="4"/>
+        <w:pStyle w:val="6"/>
         <w:ind w:firstLine="720" w:firstLineChars="0"/>
         <w:rPr>
           <w:rFonts w:cstheme="minorHAnsi"/>
@@ -1239,7 +1226,7 @@
     </w:p>
     <w:p>
       <w:pPr>
-        <w:pStyle w:val="4"/>
+        <w:pStyle w:val="6"/>
         <w:rPr>
           <w:rFonts w:cstheme="minorHAnsi"/>
           <w:b/>
@@ -1251,7 +1238,7 @@
     </w:p>
     <w:p>
       <w:pPr>
-        <w:pStyle w:val="4"/>
+        <w:pStyle w:val="6"/>
         <w:rPr>
           <w:rFonts w:cstheme="minorHAnsi"/>
           <w:b/>
@@ -1273,7 +1260,7 @@
     </w:p>
     <w:p>
       <w:pPr>
-        <w:pStyle w:val="4"/>
+        <w:pStyle w:val="6"/>
         <w:numPr>
           <w:ilvl w:val="0"/>
           <w:numId w:val="1"/>
@@ -1296,7 +1283,7 @@
     </w:p>
     <w:p>
       <w:pPr>
-        <w:pStyle w:val="4"/>
+        <w:pStyle w:val="6"/>
         <w:numPr>
           <w:ilvl w:val="0"/>
           <w:numId w:val="1"/>
@@ -1319,7 +1306,7 @@
     </w:p>
     <w:p>
       <w:pPr>
-        <w:pStyle w:val="4"/>
+        <w:pStyle w:val="6"/>
         <w:numPr>
           <w:ilvl w:val="0"/>
           <w:numId w:val="1"/>
@@ -1342,8 +1329,24 @@
     </w:p>
     <w:p>
       <w:pPr>
-        <w:pStyle w:val="4"/>
+        <w:pStyle w:val="6"/>
         <w:numPr>
+          <w:ilvl w:val="0"/>
+          <w:numId w:val="1"/>
+        </w:numPr>
+        <w:ind w:left="420" w:leftChars="0" w:hanging="420" w:firstLineChars="0"/>
+        <w:rPr>
+          <w:rFonts w:cstheme="minorHAnsi"/>
+          <w:sz w:val="15"/>
+          <w:szCs w:val="15"/>
+        </w:rPr>
+      </w:pPr>
+    </w:p>
+    <w:p>
+      <w:pPr>
+        <w:pStyle w:val="6"/>
+        <w:numPr>
+          <w:ilvl w:val="0"/>
           <w:numId w:val="0"/>
         </w:numPr>
         <w:tabs>
@@ -1359,8 +1362,9 @@
     </w:p>
     <w:p>
       <w:pPr>
-        <w:pStyle w:val="4"/>
+        <w:pStyle w:val="6"/>
         <w:numPr>
+          <w:ilvl w:val="0"/>
           <w:numId w:val="0"/>
         </w:numPr>
         <w:tabs>
@@ -1376,8 +1380,9 @@
     </w:p>
     <w:p>
       <w:pPr>
-        <w:pStyle w:val="4"/>
+        <w:pStyle w:val="6"/>
         <w:numPr>
+          <w:ilvl w:val="0"/>
           <w:numId w:val="0"/>
         </w:numPr>
         <w:tabs>
@@ -1393,76 +1398,140 @@
     </w:p>
     <w:p>
       <w:pPr>
-        <w:pStyle w:val="4"/>
+        <w:spacing w:line="240" w:lineRule="auto"/>
+        <w:ind w:left="3600" w:leftChars="0" w:firstLine="720" w:firstLineChars="0"/>
+        <w:jc w:val="both"/>
+        <w:rPr>
+          <w:rFonts w:hint="default"/>
+          <w:b/>
+          <w:bCs/>
+          <w:sz w:val="15"/>
+          <w:szCs w:val="15"/>
+          <w:u w:val="none"/>
+          <w:lang w:val="en-PH"/>
+        </w:rPr>
+      </w:pPr>
+      <w:r>
+        <w:rPr>
+          <w:sz w:val="15"/>
+        </w:rPr>
+        <mc:AlternateContent>
+          <mc:Choice Requires="wps">
+            <w:drawing>
+              <wp:anchor distT="0" distB="0" distL="114300" distR="114300" simplePos="0" relativeHeight="251662336" behindDoc="0" locked="0" layoutInCell="1" allowOverlap="1">
+                <wp:simplePos x="0" y="0"/>
+                <wp:positionH relativeFrom="column">
+                  <wp:posOffset>2562860</wp:posOffset>
+                </wp:positionH>
+                <wp:positionV relativeFrom="paragraph">
+                  <wp:posOffset>152400</wp:posOffset>
+                </wp:positionV>
+                <wp:extent cx="1447165" cy="9525"/>
+                <wp:effectExtent l="0" t="0" r="0" b="0"/>
+                <wp:wrapNone/>
+                <wp:docPr id="6" name="Straight Connector 6"/>
+                <wp:cNvGraphicFramePr/>
+                <a:graphic xmlns:a="http://schemas.openxmlformats.org/drawingml/2006/main">
+                  <a:graphicData uri="http://schemas.microsoft.com/office/word/2010/wordprocessingShape">
+                    <wps:wsp>
+                      <wps:cNvCnPr/>
+                      <wps:spPr>
+                        <a:xfrm>
+                          <a:off x="7134860" y="6151880"/>
+                          <a:ext cx="1447165" cy="9525"/>
+                        </a:xfrm>
+                        <a:prstGeom prst="line">
+                          <a:avLst/>
+                        </a:prstGeom>
+                        <a:ln>
+                          <a:solidFill>
+                            <a:schemeClr val="tx1"/>
+                          </a:solidFill>
+                        </a:ln>
+                      </wps:spPr>
+                      <wps:style>
+                        <a:lnRef idx="2">
+                          <a:schemeClr val="accent1"/>
+                        </a:lnRef>
+                        <a:fillRef idx="0">
+                          <a:srgbClr val="FFFFFF"/>
+                        </a:fillRef>
+                        <a:effectRef idx="0">
+                          <a:srgbClr val="FFFFFF"/>
+                        </a:effectRef>
+                        <a:fontRef idx="minor">
+                          <a:schemeClr val="tx1"/>
+                        </a:fontRef>
+                      </wps:style>
+                      <wps:bodyPr/>
+                    </wps:wsp>
+                  </a:graphicData>
+                </a:graphic>
+              </wp:anchor>
+            </w:drawing>
+          </mc:Choice>
+          <mc:Fallback>
+            <w:pict>
+              <v:line id="_x0000_s1026" o:spid="_x0000_s1026" o:spt="20" style="position:absolute;left:0pt;margin-left:201.8pt;margin-top:12pt;height:0.75pt;width:113.95pt;z-index:251662336;mso-width-relative:page;mso-height-relative:page;" filled="f" stroked="t" coordsize="21600,21600" o:gfxdata="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">
+                <v:fill on="f" focussize="0,0"/>
+                <v:stroke weight="1pt" color="#000000 [3213]" miterlimit="8" joinstyle="miter"/>
+                <v:imagedata o:title=""/>
+                <o:lock v:ext="edit" aspectratio="f"/>
+              </v:line>
+            </w:pict>
+          </mc:Fallback>
+        </mc:AlternateContent>
+      </w:r>
+      <w:r>
+        <w:rPr>
+          <w:rFonts w:hint="default"/>
+          <w:b/>
+          <w:bCs/>
+          <w:sz w:val="15"/>
+          <w:szCs w:val="15"/>
+          <w:u w:val="none"/>
+          <w:lang w:val="en-PH"/>
+        </w:rPr>
+        <w:t>Osas Director/Administrator</w:t>
+      </w:r>
+    </w:p>
+    <w:p>
+      <w:pPr>
+        <w:spacing w:line="240" w:lineRule="auto"/>
+        <w:ind w:left="3600" w:leftChars="0" w:firstLine="720" w:firstLineChars="0"/>
+        <w:jc w:val="both"/>
+        <w:rPr>
+          <w:rFonts w:hint="default"/>
+          <w:b/>
+          <w:bCs/>
+          <w:i/>
+          <w:iCs/>
+          <w:sz w:val="15"/>
+          <w:szCs w:val="15"/>
+          <w:u w:val="none"/>
+          <w:lang w:val="en-PH"/>
+        </w:rPr>
+      </w:pPr>
+      <w:r>
+        <w:rPr>
+          <w:rFonts w:hint="default"/>
+          <w:b/>
+          <w:bCs/>
+          <w:i/>
+          <w:iCs/>
+          <w:sz w:val="15"/>
+          <w:szCs w:val="15"/>
+          <w:u w:val="none"/>
+          <w:lang w:val="en-PH"/>
+        </w:rPr>
+        <w:t>Signature Over Printed Name</w:t>
+      </w:r>
+    </w:p>
+    <w:p>
+      <w:pPr>
+        <w:pStyle w:val="6"/>
         <w:numPr>
-          <w:numId w:val="0"/>
-        </w:numPr>
-        <w:tabs>
-          <w:tab w:val="left" w:pos="420"/>
-        </w:tabs>
-        <w:spacing w:after="0" w:line="240" w:lineRule="auto"/>
-        <w:rPr>
-          <w:rFonts w:cstheme="minorHAnsi"/>
-          <w:sz w:val="15"/>
-          <w:szCs w:val="15"/>
-        </w:rPr>
-      </w:pPr>
-    </w:p>
-    <w:p>
-      <w:pPr>
-        <w:pStyle w:val="4"/>
-        <w:numPr>
-          <w:numId w:val="0"/>
-        </w:numPr>
-        <w:tabs>
-          <w:tab w:val="left" w:pos="420"/>
-        </w:tabs>
-        <w:spacing w:after="0" w:line="240" w:lineRule="auto"/>
-        <w:rPr>
-          <w:rFonts w:cstheme="minorHAnsi"/>
-          <w:sz w:val="15"/>
-          <w:szCs w:val="15"/>
-        </w:rPr>
-      </w:pPr>
-    </w:p>
-    <w:p>
-      <w:pPr>
-        <w:pStyle w:val="4"/>
-        <w:numPr>
-          <w:numId w:val="0"/>
-        </w:numPr>
-        <w:tabs>
-          <w:tab w:val="left" w:pos="420"/>
-        </w:tabs>
-        <w:spacing w:after="0" w:line="240" w:lineRule="auto"/>
-        <w:rPr>
-          <w:rFonts w:cstheme="minorHAnsi"/>
-          <w:sz w:val="15"/>
-          <w:szCs w:val="15"/>
-        </w:rPr>
-      </w:pPr>
-    </w:p>
-    <w:p>
-      <w:pPr>
-        <w:pStyle w:val="4"/>
-        <w:numPr>
-          <w:numId w:val="0"/>
-        </w:numPr>
-        <w:tabs>
-          <w:tab w:val="left" w:pos="420"/>
-        </w:tabs>
-        <w:spacing w:after="0" w:line="240" w:lineRule="auto"/>
-        <w:rPr>
-          <w:rFonts w:cstheme="minorHAnsi"/>
-          <w:sz w:val="15"/>
-          <w:szCs w:val="15"/>
-        </w:rPr>
-      </w:pPr>
-    </w:p>
-    <w:p>
-      <w:pPr>
-        <w:pStyle w:val="4"/>
-        <w:numPr>
+          <w:ilvl w:val="0"/>
           <w:numId w:val="0"/>
         </w:numPr>
         <w:tabs>
@@ -1550,8 +1619,9 @@
     </w:p>
     <w:p>
       <w:pPr>
-        <w:pStyle w:val="4"/>
+        <w:pStyle w:val="6"/>
         <w:numPr>
+          <w:ilvl w:val="0"/>
           <w:numId w:val="0"/>
         </w:numPr>
         <w:tabs>
@@ -1567,25 +1637,9 @@
     </w:p>
     <w:p>
       <w:pPr>
-        <w:pStyle w:val="4"/>
+        <w:pStyle w:val="6"/>
         <w:numPr>
-          <w:numId w:val="0"/>
-        </w:numPr>
-        <w:tabs>
-          <w:tab w:val="left" w:pos="420"/>
-        </w:tabs>
-        <w:spacing w:after="0" w:line="240" w:lineRule="auto"/>
-        <w:rPr>
-          <w:rFonts w:cstheme="minorHAnsi"/>
-          <w:sz w:val="15"/>
-          <w:szCs w:val="15"/>
-        </w:rPr>
-      </w:pPr>
-    </w:p>
-    <w:p>
-      <w:pPr>
-        <w:pStyle w:val="4"/>
-        <w:numPr>
+          <w:ilvl w:val="0"/>
           <w:numId w:val="0"/>
         </w:numPr>
         <w:tabs>
@@ -1612,8 +1666,9 @@
     </w:p>
     <w:p>
       <w:pPr>
-        <w:pStyle w:val="4"/>
+        <w:pStyle w:val="6"/>
         <w:numPr>
+          <w:ilvl w:val="0"/>
           <w:numId w:val="0"/>
         </w:numPr>
         <w:tabs>
@@ -1629,7 +1684,7 @@
     </w:p>
     <w:p>
       <w:pPr>
-        <w:pStyle w:val="4"/>
+        <w:pStyle w:val="6"/>
         <w:ind w:firstLine="375" w:firstLineChars="250"/>
         <w:rPr>
           <w:rFonts w:ascii="Century Gothic" w:hAnsi="Century Gothic"/>
@@ -1665,7 +1720,7 @@
     </w:p>
     <w:p>
       <w:pPr>
-        <w:pStyle w:val="4"/>
+        <w:pStyle w:val="6"/>
         <w:ind w:left="720" w:leftChars="0" w:firstLine="720" w:firstLineChars="0"/>
         <w:rPr>
           <w:rFonts w:ascii="Century Gothic" w:hAnsi="Century Gothic"/>
@@ -1676,7 +1731,7 @@
     </w:p>
     <w:p>
       <w:pPr>
-        <w:pStyle w:val="4"/>
+        <w:pStyle w:val="6"/>
         <w:ind w:firstLine="375" w:firstLineChars="250"/>
         <w:rPr>
           <w:rFonts w:ascii="Century Gothic" w:hAnsi="Century Gothic"/>
@@ -1695,7 +1750,7 @@
     </w:p>
     <w:p>
       <w:pPr>
-        <w:pStyle w:val="4"/>
+        <w:pStyle w:val="6"/>
         <w:ind w:firstLine="375" w:firstLineChars="250"/>
         <w:rPr>
           <w:rFonts w:ascii="Century Gothic" w:hAnsi="Century Gothic"/>
@@ -1760,7 +1815,7 @@
           </w:tcPr>
           <w:p>
             <w:pPr>
-              <w:pStyle w:val="4"/>
+              <w:pStyle w:val="6"/>
               <w:rPr>
                 <w:rFonts w:ascii="Century Gothic" w:hAnsi="Century Gothic"/>
                 <w:b/>
@@ -1801,7 +1856,7 @@
           </w:tcPr>
           <w:p>
             <w:pPr>
-              <w:pStyle w:val="4"/>
+              <w:pStyle w:val="6"/>
               <w:rPr>
                 <w:rFonts w:ascii="Century Gothic" w:hAnsi="Century Gothic"/>
                 <w:b/>
@@ -1843,7 +1898,7 @@
           </w:tcPr>
           <w:p>
             <w:pPr>
-              <w:pStyle w:val="4"/>
+              <w:pStyle w:val="6"/>
               <w:rPr>
                 <w:rFonts w:ascii="Century Gothic" w:hAnsi="Century Gothic"/>
                 <w:b/>
@@ -1881,37 +1936,37 @@
           </w:tcPr>
           <w:p>
             <w:pPr>
-              <w:pStyle w:val="4"/>
-              <w:rPr>
-                <w:rFonts w:ascii="Century Gothic" w:hAnsi="Century Gothic"/>
-                <w:b/>
-                <w:bCs/>
-                <w:sz w:val="15"/>
-                <w:szCs w:val="15"/>
-              </w:rPr>
-            </w:pPr>
-          </w:p>
-        </w:tc>
-        <w:tc>
-          <w:tcPr>
-            <w:tcW w:w="0" w:type="auto"/>
-            <w:tcBorders>
-              <w:top w:val="single" w:color="CCCCCC" w:sz="6" w:space="0"/>
-              <w:left w:val="single" w:color="CCCCCC" w:sz="6" w:space="0"/>
-              <w:bottom w:val="single" w:color="000000" w:sz="12" w:space="0"/>
-              <w:right w:val="single" w:color="000000" w:sz="12" w:space="0"/>
-            </w:tcBorders>
-            <w:tcMar>
-              <w:top w:w="30" w:type="dxa"/>
-              <w:left w:w="45" w:type="dxa"/>
-              <w:bottom w:w="30" w:type="dxa"/>
-              <w:right w:w="45" w:type="dxa"/>
-            </w:tcMar>
-            <w:vAlign w:val="center"/>
-          </w:tcPr>
-          <w:p>
-            <w:pPr>
-              <w:pStyle w:val="4"/>
+              <w:pStyle w:val="6"/>
+              <w:rPr>
+                <w:rFonts w:ascii="Century Gothic" w:hAnsi="Century Gothic"/>
+                <w:b/>
+                <w:bCs/>
+                <w:sz w:val="15"/>
+                <w:szCs w:val="15"/>
+              </w:rPr>
+            </w:pPr>
+          </w:p>
+        </w:tc>
+        <w:tc>
+          <w:tcPr>
+            <w:tcW w:w="0" w:type="auto"/>
+            <w:tcBorders>
+              <w:top w:val="single" w:color="CCCCCC" w:sz="6" w:space="0"/>
+              <w:left w:val="single" w:color="CCCCCC" w:sz="6" w:space="0"/>
+              <w:bottom w:val="single" w:color="000000" w:sz="12" w:space="0"/>
+              <w:right w:val="single" w:color="000000" w:sz="12" w:space="0"/>
+            </w:tcBorders>
+            <w:tcMar>
+              <w:top w:w="30" w:type="dxa"/>
+              <w:left w:w="45" w:type="dxa"/>
+              <w:bottom w:w="30" w:type="dxa"/>
+              <w:right w:w="45" w:type="dxa"/>
+            </w:tcMar>
+            <w:vAlign w:val="center"/>
+          </w:tcPr>
+          <w:p>
+            <w:pPr>
+              <w:pStyle w:val="6"/>
               <w:jc w:val="center"/>
               <w:rPr>
                 <w:rFonts w:ascii="Century Gothic" w:hAnsi="Century Gothic"/>
@@ -1952,7 +2007,7 @@
           </w:tcPr>
           <w:p>
             <w:pPr>
-              <w:pStyle w:val="4"/>
+              <w:pStyle w:val="6"/>
               <w:jc w:val="center"/>
               <w:rPr>
                 <w:rFonts w:ascii="Century Gothic" w:hAnsi="Century Gothic"/>
@@ -1993,7 +2048,7 @@
           </w:tcPr>
           <w:p>
             <w:pPr>
-              <w:pStyle w:val="4"/>
+              <w:pStyle w:val="6"/>
               <w:jc w:val="center"/>
               <w:rPr>
                 <w:rFonts w:ascii="Century Gothic" w:hAnsi="Century Gothic"/>
@@ -2034,7 +2089,7 @@
           </w:tcPr>
           <w:p>
             <w:pPr>
-              <w:pStyle w:val="4"/>
+              <w:pStyle w:val="6"/>
               <w:jc w:val="center"/>
               <w:rPr>
                 <w:rFonts w:ascii="Century Gothic" w:hAnsi="Century Gothic"/>
@@ -2075,7 +2130,7 @@
           </w:tcPr>
           <w:p>
             <w:pPr>
-              <w:pStyle w:val="4"/>
+              <w:pStyle w:val="6"/>
               <w:jc w:val="center"/>
               <w:rPr>
                 <w:rFonts w:ascii="Century Gothic" w:hAnsi="Century Gothic"/>
@@ -2129,7 +2184,7 @@
           </w:tcPr>
           <w:p>
             <w:pPr>
-              <w:pStyle w:val="4"/>
+              <w:pStyle w:val="6"/>
               <w:rPr>
                 <w:rFonts w:ascii="Century Gothic" w:hAnsi="Century Gothic"/>
                 <w:b/>
@@ -2169,121 +2224,121 @@
           </w:tcPr>
           <w:p>
             <w:pPr>
-              <w:pStyle w:val="4"/>
-              <w:rPr>
-                <w:rFonts w:ascii="Century Gothic" w:hAnsi="Century Gothic"/>
-                <w:b/>
-                <w:bCs/>
-                <w:sz w:val="15"/>
-                <w:szCs w:val="15"/>
-              </w:rPr>
-            </w:pPr>
-          </w:p>
-        </w:tc>
-        <w:tc>
-          <w:tcPr>
-            <w:tcW w:w="0" w:type="auto"/>
-            <w:tcBorders>
-              <w:top w:val="single" w:color="CCCCCC" w:sz="6" w:space="0"/>
-              <w:left w:val="single" w:color="CCCCCC" w:sz="6" w:space="0"/>
-              <w:bottom w:val="single" w:color="000000" w:sz="12" w:space="0"/>
-              <w:right w:val="single" w:color="000000" w:sz="12" w:space="0"/>
-            </w:tcBorders>
-            <w:tcMar>
-              <w:top w:w="30" w:type="dxa"/>
-              <w:left w:w="45" w:type="dxa"/>
-              <w:bottom w:w="30" w:type="dxa"/>
-              <w:right w:w="45" w:type="dxa"/>
-            </w:tcMar>
-            <w:vAlign w:val="center"/>
-          </w:tcPr>
-          <w:p>
-            <w:pPr>
-              <w:pStyle w:val="4"/>
-              <w:rPr>
-                <w:rFonts w:ascii="Century Gothic" w:hAnsi="Century Gothic"/>
-                <w:sz w:val="15"/>
-                <w:szCs w:val="15"/>
-              </w:rPr>
-            </w:pPr>
-          </w:p>
-        </w:tc>
-        <w:tc>
-          <w:tcPr>
-            <w:tcW w:w="0" w:type="auto"/>
-            <w:tcBorders>
-              <w:top w:val="single" w:color="CCCCCC" w:sz="6" w:space="0"/>
-              <w:left w:val="single" w:color="CCCCCC" w:sz="6" w:space="0"/>
-              <w:bottom w:val="single" w:color="000000" w:sz="12" w:space="0"/>
-              <w:right w:val="single" w:color="000000" w:sz="12" w:space="0"/>
-            </w:tcBorders>
-            <w:tcMar>
-              <w:top w:w="30" w:type="dxa"/>
-              <w:left w:w="45" w:type="dxa"/>
-              <w:bottom w:w="30" w:type="dxa"/>
-              <w:right w:w="45" w:type="dxa"/>
-            </w:tcMar>
-            <w:vAlign w:val="center"/>
-          </w:tcPr>
-          <w:p>
-            <w:pPr>
-              <w:pStyle w:val="4"/>
-              <w:rPr>
-                <w:rFonts w:ascii="Century Gothic" w:hAnsi="Century Gothic"/>
-                <w:sz w:val="15"/>
-                <w:szCs w:val="15"/>
-              </w:rPr>
-            </w:pPr>
-          </w:p>
-        </w:tc>
-        <w:tc>
-          <w:tcPr>
-            <w:tcW w:w="0" w:type="auto"/>
-            <w:tcBorders>
-              <w:top w:val="single" w:color="CCCCCC" w:sz="6" w:space="0"/>
-              <w:left w:val="single" w:color="CCCCCC" w:sz="6" w:space="0"/>
-              <w:bottom w:val="single" w:color="000000" w:sz="12" w:space="0"/>
-              <w:right w:val="single" w:color="000000" w:sz="12" w:space="0"/>
-            </w:tcBorders>
-            <w:tcMar>
-              <w:top w:w="30" w:type="dxa"/>
-              <w:left w:w="45" w:type="dxa"/>
-              <w:bottom w:w="30" w:type="dxa"/>
-              <w:right w:w="45" w:type="dxa"/>
-            </w:tcMar>
-            <w:vAlign w:val="center"/>
-          </w:tcPr>
-          <w:p>
-            <w:pPr>
-              <w:pStyle w:val="4"/>
-              <w:rPr>
-                <w:rFonts w:ascii="Century Gothic" w:hAnsi="Century Gothic"/>
-                <w:sz w:val="15"/>
-                <w:szCs w:val="15"/>
-              </w:rPr>
-            </w:pPr>
-          </w:p>
-        </w:tc>
-        <w:tc>
-          <w:tcPr>
-            <w:tcW w:w="0" w:type="auto"/>
-            <w:tcBorders>
-              <w:top w:val="single" w:color="CCCCCC" w:sz="6" w:space="0"/>
-              <w:left w:val="single" w:color="CCCCCC" w:sz="6" w:space="0"/>
-              <w:bottom w:val="single" w:color="000000" w:sz="12" w:space="0"/>
-              <w:right w:val="single" w:color="000000" w:sz="12" w:space="0"/>
-            </w:tcBorders>
-            <w:tcMar>
-              <w:top w:w="30" w:type="dxa"/>
-              <w:left w:w="45" w:type="dxa"/>
-              <w:bottom w:w="30" w:type="dxa"/>
-              <w:right w:w="45" w:type="dxa"/>
-            </w:tcMar>
-            <w:vAlign w:val="center"/>
-          </w:tcPr>
-          <w:p>
-            <w:pPr>
-              <w:pStyle w:val="4"/>
+              <w:pStyle w:val="6"/>
+              <w:rPr>
+                <w:rFonts w:ascii="Century Gothic" w:hAnsi="Century Gothic"/>
+                <w:b/>
+                <w:bCs/>
+                <w:sz w:val="15"/>
+                <w:szCs w:val="15"/>
+              </w:rPr>
+            </w:pPr>
+          </w:p>
+        </w:tc>
+        <w:tc>
+          <w:tcPr>
+            <w:tcW w:w="0" w:type="auto"/>
+            <w:tcBorders>
+              <w:top w:val="single" w:color="CCCCCC" w:sz="6" w:space="0"/>
+              <w:left w:val="single" w:color="CCCCCC" w:sz="6" w:space="0"/>
+              <w:bottom w:val="single" w:color="000000" w:sz="12" w:space="0"/>
+              <w:right w:val="single" w:color="000000" w:sz="12" w:space="0"/>
+            </w:tcBorders>
+            <w:tcMar>
+              <w:top w:w="30" w:type="dxa"/>
+              <w:left w:w="45" w:type="dxa"/>
+              <w:bottom w:w="30" w:type="dxa"/>
+              <w:right w:w="45" w:type="dxa"/>
+            </w:tcMar>
+            <w:vAlign w:val="center"/>
+          </w:tcPr>
+          <w:p>
+            <w:pPr>
+              <w:pStyle w:val="6"/>
+              <w:rPr>
+                <w:rFonts w:ascii="Century Gothic" w:hAnsi="Century Gothic"/>
+                <w:sz w:val="15"/>
+                <w:szCs w:val="15"/>
+              </w:rPr>
+            </w:pPr>
+          </w:p>
+        </w:tc>
+        <w:tc>
+          <w:tcPr>
+            <w:tcW w:w="0" w:type="auto"/>
+            <w:tcBorders>
+              <w:top w:val="single" w:color="CCCCCC" w:sz="6" w:space="0"/>
+              <w:left w:val="single" w:color="CCCCCC" w:sz="6" w:space="0"/>
+              <w:bottom w:val="single" w:color="000000" w:sz="12" w:space="0"/>
+              <w:right w:val="single" w:color="000000" w:sz="12" w:space="0"/>
+            </w:tcBorders>
+            <w:tcMar>
+              <w:top w:w="30" w:type="dxa"/>
+              <w:left w:w="45" w:type="dxa"/>
+              <w:bottom w:w="30" w:type="dxa"/>
+              <w:right w:w="45" w:type="dxa"/>
+            </w:tcMar>
+            <w:vAlign w:val="center"/>
+          </w:tcPr>
+          <w:p>
+            <w:pPr>
+              <w:pStyle w:val="6"/>
+              <w:rPr>
+                <w:rFonts w:ascii="Century Gothic" w:hAnsi="Century Gothic"/>
+                <w:sz w:val="15"/>
+                <w:szCs w:val="15"/>
+              </w:rPr>
+            </w:pPr>
+          </w:p>
+        </w:tc>
+        <w:tc>
+          <w:tcPr>
+            <w:tcW w:w="0" w:type="auto"/>
+            <w:tcBorders>
+              <w:top w:val="single" w:color="CCCCCC" w:sz="6" w:space="0"/>
+              <w:left w:val="single" w:color="CCCCCC" w:sz="6" w:space="0"/>
+              <w:bottom w:val="single" w:color="000000" w:sz="12" w:space="0"/>
+              <w:right w:val="single" w:color="000000" w:sz="12" w:space="0"/>
+            </w:tcBorders>
+            <w:tcMar>
+              <w:top w:w="30" w:type="dxa"/>
+              <w:left w:w="45" w:type="dxa"/>
+              <w:bottom w:w="30" w:type="dxa"/>
+              <w:right w:w="45" w:type="dxa"/>
+            </w:tcMar>
+            <w:vAlign w:val="center"/>
+          </w:tcPr>
+          <w:p>
+            <w:pPr>
+              <w:pStyle w:val="6"/>
+              <w:rPr>
+                <w:rFonts w:ascii="Century Gothic" w:hAnsi="Century Gothic"/>
+                <w:sz w:val="15"/>
+                <w:szCs w:val="15"/>
+              </w:rPr>
+            </w:pPr>
+          </w:p>
+        </w:tc>
+        <w:tc>
+          <w:tcPr>
+            <w:tcW w:w="0" w:type="auto"/>
+            <w:tcBorders>
+              <w:top w:val="single" w:color="CCCCCC" w:sz="6" w:space="0"/>
+              <w:left w:val="single" w:color="CCCCCC" w:sz="6" w:space="0"/>
+              <w:bottom w:val="single" w:color="000000" w:sz="12" w:space="0"/>
+              <w:right w:val="single" w:color="000000" w:sz="12" w:space="0"/>
+            </w:tcBorders>
+            <w:tcMar>
+              <w:top w:w="30" w:type="dxa"/>
+              <w:left w:w="45" w:type="dxa"/>
+              <w:bottom w:w="30" w:type="dxa"/>
+              <w:right w:w="45" w:type="dxa"/>
+            </w:tcMar>
+            <w:vAlign w:val="center"/>
+          </w:tcPr>
+          <w:p>
+            <w:pPr>
+              <w:pStyle w:val="6"/>
               <w:rPr>
                 <w:rFonts w:ascii="Century Gothic" w:hAnsi="Century Gothic"/>
                 <w:sz w:val="15"/>
@@ -2324,7 +2379,7 @@
           </w:tcPr>
           <w:p>
             <w:pPr>
-              <w:pStyle w:val="4"/>
+              <w:pStyle w:val="6"/>
               <w:rPr>
                 <w:rFonts w:ascii="Century Gothic" w:hAnsi="Century Gothic"/>
                 <w:b/>
@@ -2364,121 +2419,121 @@
           </w:tcPr>
           <w:p>
             <w:pPr>
-              <w:pStyle w:val="4"/>
-              <w:rPr>
-                <w:rFonts w:ascii="Century Gothic" w:hAnsi="Century Gothic"/>
-                <w:b/>
-                <w:bCs/>
-                <w:sz w:val="15"/>
-                <w:szCs w:val="15"/>
-              </w:rPr>
-            </w:pPr>
-          </w:p>
-        </w:tc>
-        <w:tc>
-          <w:tcPr>
-            <w:tcW w:w="0" w:type="auto"/>
-            <w:tcBorders>
-              <w:top w:val="single" w:color="CCCCCC" w:sz="6" w:space="0"/>
-              <w:left w:val="single" w:color="CCCCCC" w:sz="6" w:space="0"/>
-              <w:bottom w:val="single" w:color="000000" w:sz="12" w:space="0"/>
-              <w:right w:val="single" w:color="000000" w:sz="12" w:space="0"/>
-            </w:tcBorders>
-            <w:tcMar>
-              <w:top w:w="30" w:type="dxa"/>
-              <w:left w:w="45" w:type="dxa"/>
-              <w:bottom w:w="30" w:type="dxa"/>
-              <w:right w:w="45" w:type="dxa"/>
-            </w:tcMar>
-            <w:vAlign w:val="center"/>
-          </w:tcPr>
-          <w:p>
-            <w:pPr>
-              <w:pStyle w:val="4"/>
-              <w:rPr>
-                <w:rFonts w:ascii="Century Gothic" w:hAnsi="Century Gothic"/>
-                <w:sz w:val="15"/>
-                <w:szCs w:val="15"/>
-              </w:rPr>
-            </w:pPr>
-          </w:p>
-        </w:tc>
-        <w:tc>
-          <w:tcPr>
-            <w:tcW w:w="0" w:type="auto"/>
-            <w:tcBorders>
-              <w:top w:val="single" w:color="CCCCCC" w:sz="6" w:space="0"/>
-              <w:left w:val="single" w:color="CCCCCC" w:sz="6" w:space="0"/>
-              <w:bottom w:val="single" w:color="000000" w:sz="12" w:space="0"/>
-              <w:right w:val="single" w:color="000000" w:sz="12" w:space="0"/>
-            </w:tcBorders>
-            <w:tcMar>
-              <w:top w:w="30" w:type="dxa"/>
-              <w:left w:w="45" w:type="dxa"/>
-              <w:bottom w:w="30" w:type="dxa"/>
-              <w:right w:w="45" w:type="dxa"/>
-            </w:tcMar>
-            <w:vAlign w:val="center"/>
-          </w:tcPr>
-          <w:p>
-            <w:pPr>
-              <w:pStyle w:val="4"/>
-              <w:rPr>
-                <w:rFonts w:ascii="Century Gothic" w:hAnsi="Century Gothic"/>
-                <w:sz w:val="15"/>
-                <w:szCs w:val="15"/>
-              </w:rPr>
-            </w:pPr>
-          </w:p>
-        </w:tc>
-        <w:tc>
-          <w:tcPr>
-            <w:tcW w:w="0" w:type="auto"/>
-            <w:tcBorders>
-              <w:top w:val="single" w:color="CCCCCC" w:sz="6" w:space="0"/>
-              <w:left w:val="single" w:color="CCCCCC" w:sz="6" w:space="0"/>
-              <w:bottom w:val="single" w:color="000000" w:sz="12" w:space="0"/>
-              <w:right w:val="single" w:color="000000" w:sz="12" w:space="0"/>
-            </w:tcBorders>
-            <w:tcMar>
-              <w:top w:w="30" w:type="dxa"/>
-              <w:left w:w="45" w:type="dxa"/>
-              <w:bottom w:w="30" w:type="dxa"/>
-              <w:right w:w="45" w:type="dxa"/>
-            </w:tcMar>
-            <w:vAlign w:val="center"/>
-          </w:tcPr>
-          <w:p>
-            <w:pPr>
-              <w:pStyle w:val="4"/>
-              <w:rPr>
-                <w:rFonts w:ascii="Century Gothic" w:hAnsi="Century Gothic"/>
-                <w:sz w:val="15"/>
-                <w:szCs w:val="15"/>
-              </w:rPr>
-            </w:pPr>
-          </w:p>
-        </w:tc>
-        <w:tc>
-          <w:tcPr>
-            <w:tcW w:w="0" w:type="auto"/>
-            <w:tcBorders>
-              <w:top w:val="single" w:color="CCCCCC" w:sz="6" w:space="0"/>
-              <w:left w:val="single" w:color="CCCCCC" w:sz="6" w:space="0"/>
-              <w:bottom w:val="single" w:color="000000" w:sz="12" w:space="0"/>
-              <w:right w:val="single" w:color="000000" w:sz="12" w:space="0"/>
-            </w:tcBorders>
-            <w:tcMar>
-              <w:top w:w="30" w:type="dxa"/>
-              <w:left w:w="45" w:type="dxa"/>
-              <w:bottom w:w="30" w:type="dxa"/>
-              <w:right w:w="45" w:type="dxa"/>
-            </w:tcMar>
-            <w:vAlign w:val="center"/>
-          </w:tcPr>
-          <w:p>
-            <w:pPr>
-              <w:pStyle w:val="4"/>
+              <w:pStyle w:val="6"/>
+              <w:rPr>
+                <w:rFonts w:ascii="Century Gothic" w:hAnsi="Century Gothic"/>
+                <w:b/>
+                <w:bCs/>
+                <w:sz w:val="15"/>
+                <w:szCs w:val="15"/>
+              </w:rPr>
+            </w:pPr>
+          </w:p>
+        </w:tc>
+        <w:tc>
+          <w:tcPr>
+            <w:tcW w:w="0" w:type="auto"/>
+            <w:tcBorders>
+              <w:top w:val="single" w:color="CCCCCC" w:sz="6" w:space="0"/>
+              <w:left w:val="single" w:color="CCCCCC" w:sz="6" w:space="0"/>
+              <w:bottom w:val="single" w:color="000000" w:sz="12" w:space="0"/>
+              <w:right w:val="single" w:color="000000" w:sz="12" w:space="0"/>
+            </w:tcBorders>
+            <w:tcMar>
+              <w:top w:w="30" w:type="dxa"/>
+              <w:left w:w="45" w:type="dxa"/>
+              <w:bottom w:w="30" w:type="dxa"/>
+              <w:right w:w="45" w:type="dxa"/>
+            </w:tcMar>
+            <w:vAlign w:val="center"/>
+          </w:tcPr>
+          <w:p>
+            <w:pPr>
+              <w:pStyle w:val="6"/>
+              <w:rPr>
+                <w:rFonts w:ascii="Century Gothic" w:hAnsi="Century Gothic"/>
+                <w:sz w:val="15"/>
+                <w:szCs w:val="15"/>
+              </w:rPr>
+            </w:pPr>
+          </w:p>
+        </w:tc>
+        <w:tc>
+          <w:tcPr>
+            <w:tcW w:w="0" w:type="auto"/>
+            <w:tcBorders>
+              <w:top w:val="single" w:color="CCCCCC" w:sz="6" w:space="0"/>
+              <w:left w:val="single" w:color="CCCCCC" w:sz="6" w:space="0"/>
+              <w:bottom w:val="single" w:color="000000" w:sz="12" w:space="0"/>
+              <w:right w:val="single" w:color="000000" w:sz="12" w:space="0"/>
+            </w:tcBorders>
+            <w:tcMar>
+              <w:top w:w="30" w:type="dxa"/>
+              <w:left w:w="45" w:type="dxa"/>
+              <w:bottom w:w="30" w:type="dxa"/>
+              <w:right w:w="45" w:type="dxa"/>
+            </w:tcMar>
+            <w:vAlign w:val="center"/>
+          </w:tcPr>
+          <w:p>
+            <w:pPr>
+              <w:pStyle w:val="6"/>
+              <w:rPr>
+                <w:rFonts w:ascii="Century Gothic" w:hAnsi="Century Gothic"/>
+                <w:sz w:val="15"/>
+                <w:szCs w:val="15"/>
+              </w:rPr>
+            </w:pPr>
+          </w:p>
+        </w:tc>
+        <w:tc>
+          <w:tcPr>
+            <w:tcW w:w="0" w:type="auto"/>
+            <w:tcBorders>
+              <w:top w:val="single" w:color="CCCCCC" w:sz="6" w:space="0"/>
+              <w:left w:val="single" w:color="CCCCCC" w:sz="6" w:space="0"/>
+              <w:bottom w:val="single" w:color="000000" w:sz="12" w:space="0"/>
+              <w:right w:val="single" w:color="000000" w:sz="12" w:space="0"/>
+            </w:tcBorders>
+            <w:tcMar>
+              <w:top w:w="30" w:type="dxa"/>
+              <w:left w:w="45" w:type="dxa"/>
+              <w:bottom w:w="30" w:type="dxa"/>
+              <w:right w:w="45" w:type="dxa"/>
+            </w:tcMar>
+            <w:vAlign w:val="center"/>
+          </w:tcPr>
+          <w:p>
+            <w:pPr>
+              <w:pStyle w:val="6"/>
+              <w:rPr>
+                <w:rFonts w:ascii="Century Gothic" w:hAnsi="Century Gothic"/>
+                <w:sz w:val="15"/>
+                <w:szCs w:val="15"/>
+              </w:rPr>
+            </w:pPr>
+          </w:p>
+        </w:tc>
+        <w:tc>
+          <w:tcPr>
+            <w:tcW w:w="0" w:type="auto"/>
+            <w:tcBorders>
+              <w:top w:val="single" w:color="CCCCCC" w:sz="6" w:space="0"/>
+              <w:left w:val="single" w:color="CCCCCC" w:sz="6" w:space="0"/>
+              <w:bottom w:val="single" w:color="000000" w:sz="12" w:space="0"/>
+              <w:right w:val="single" w:color="000000" w:sz="12" w:space="0"/>
+            </w:tcBorders>
+            <w:tcMar>
+              <w:top w:w="30" w:type="dxa"/>
+              <w:left w:w="45" w:type="dxa"/>
+              <w:bottom w:w="30" w:type="dxa"/>
+              <w:right w:w="45" w:type="dxa"/>
+            </w:tcMar>
+            <w:vAlign w:val="center"/>
+          </w:tcPr>
+          <w:p>
+            <w:pPr>
+              <w:pStyle w:val="6"/>
               <w:rPr>
                 <w:rFonts w:ascii="Century Gothic" w:hAnsi="Century Gothic"/>
                 <w:sz w:val="15"/>
@@ -2519,7 +2574,7 @@
           </w:tcPr>
           <w:p>
             <w:pPr>
-              <w:pStyle w:val="4"/>
+              <w:pStyle w:val="6"/>
               <w:rPr>
                 <w:rFonts w:ascii="Century Gothic" w:hAnsi="Century Gothic"/>
                 <w:b/>
@@ -2559,121 +2614,121 @@
           </w:tcPr>
           <w:p>
             <w:pPr>
-              <w:pStyle w:val="4"/>
-              <w:rPr>
-                <w:rFonts w:ascii="Century Gothic" w:hAnsi="Century Gothic"/>
-                <w:b/>
-                <w:bCs/>
-                <w:sz w:val="15"/>
-                <w:szCs w:val="15"/>
-              </w:rPr>
-            </w:pPr>
-          </w:p>
-        </w:tc>
-        <w:tc>
-          <w:tcPr>
-            <w:tcW w:w="0" w:type="auto"/>
-            <w:tcBorders>
-              <w:top w:val="single" w:color="CCCCCC" w:sz="6" w:space="0"/>
-              <w:left w:val="single" w:color="CCCCCC" w:sz="6" w:space="0"/>
-              <w:bottom w:val="single" w:color="000000" w:sz="12" w:space="0"/>
-              <w:right w:val="single" w:color="000000" w:sz="12" w:space="0"/>
-            </w:tcBorders>
-            <w:tcMar>
-              <w:top w:w="30" w:type="dxa"/>
-              <w:left w:w="45" w:type="dxa"/>
-              <w:bottom w:w="30" w:type="dxa"/>
-              <w:right w:w="45" w:type="dxa"/>
-            </w:tcMar>
-            <w:vAlign w:val="center"/>
-          </w:tcPr>
-          <w:p>
-            <w:pPr>
-              <w:pStyle w:val="4"/>
-              <w:rPr>
-                <w:rFonts w:ascii="Century Gothic" w:hAnsi="Century Gothic"/>
-                <w:sz w:val="15"/>
-                <w:szCs w:val="15"/>
-              </w:rPr>
-            </w:pPr>
-          </w:p>
-        </w:tc>
-        <w:tc>
-          <w:tcPr>
-            <w:tcW w:w="0" w:type="auto"/>
-            <w:tcBorders>
-              <w:top w:val="single" w:color="CCCCCC" w:sz="6" w:space="0"/>
-              <w:left w:val="single" w:color="CCCCCC" w:sz="6" w:space="0"/>
-              <w:bottom w:val="single" w:color="000000" w:sz="12" w:space="0"/>
-              <w:right w:val="single" w:color="000000" w:sz="12" w:space="0"/>
-            </w:tcBorders>
-            <w:tcMar>
-              <w:top w:w="30" w:type="dxa"/>
-              <w:left w:w="45" w:type="dxa"/>
-              <w:bottom w:w="30" w:type="dxa"/>
-              <w:right w:w="45" w:type="dxa"/>
-            </w:tcMar>
-            <w:vAlign w:val="center"/>
-          </w:tcPr>
-          <w:p>
-            <w:pPr>
-              <w:pStyle w:val="4"/>
-              <w:rPr>
-                <w:rFonts w:ascii="Century Gothic" w:hAnsi="Century Gothic"/>
-                <w:sz w:val="15"/>
-                <w:szCs w:val="15"/>
-              </w:rPr>
-            </w:pPr>
-          </w:p>
-        </w:tc>
-        <w:tc>
-          <w:tcPr>
-            <w:tcW w:w="0" w:type="auto"/>
-            <w:tcBorders>
-              <w:top w:val="single" w:color="CCCCCC" w:sz="6" w:space="0"/>
-              <w:left w:val="single" w:color="CCCCCC" w:sz="6" w:space="0"/>
-              <w:bottom w:val="single" w:color="000000" w:sz="12" w:space="0"/>
-              <w:right w:val="single" w:color="000000" w:sz="12" w:space="0"/>
-            </w:tcBorders>
-            <w:tcMar>
-              <w:top w:w="30" w:type="dxa"/>
-              <w:left w:w="45" w:type="dxa"/>
-              <w:bottom w:w="30" w:type="dxa"/>
-              <w:right w:w="45" w:type="dxa"/>
-            </w:tcMar>
-            <w:vAlign w:val="center"/>
-          </w:tcPr>
-          <w:p>
-            <w:pPr>
-              <w:pStyle w:val="4"/>
-              <w:rPr>
-                <w:rFonts w:ascii="Century Gothic" w:hAnsi="Century Gothic"/>
-                <w:sz w:val="15"/>
-                <w:szCs w:val="15"/>
-              </w:rPr>
-            </w:pPr>
-          </w:p>
-        </w:tc>
-        <w:tc>
-          <w:tcPr>
-            <w:tcW w:w="0" w:type="auto"/>
-            <w:tcBorders>
-              <w:top w:val="single" w:color="CCCCCC" w:sz="6" w:space="0"/>
-              <w:left w:val="single" w:color="CCCCCC" w:sz="6" w:space="0"/>
-              <w:bottom w:val="single" w:color="000000" w:sz="12" w:space="0"/>
-              <w:right w:val="single" w:color="000000" w:sz="12" w:space="0"/>
-            </w:tcBorders>
-            <w:tcMar>
-              <w:top w:w="30" w:type="dxa"/>
-              <w:left w:w="45" w:type="dxa"/>
-              <w:bottom w:w="30" w:type="dxa"/>
-              <w:right w:w="45" w:type="dxa"/>
-            </w:tcMar>
-            <w:vAlign w:val="center"/>
-          </w:tcPr>
-          <w:p>
-            <w:pPr>
-              <w:pStyle w:val="4"/>
+              <w:pStyle w:val="6"/>
+              <w:rPr>
+                <w:rFonts w:ascii="Century Gothic" w:hAnsi="Century Gothic"/>
+                <w:b/>
+                <w:bCs/>
+                <w:sz w:val="15"/>
+                <w:szCs w:val="15"/>
+              </w:rPr>
+            </w:pPr>
+          </w:p>
+        </w:tc>
+        <w:tc>
+          <w:tcPr>
+            <w:tcW w:w="0" w:type="auto"/>
+            <w:tcBorders>
+              <w:top w:val="single" w:color="CCCCCC" w:sz="6" w:space="0"/>
+              <w:left w:val="single" w:color="CCCCCC" w:sz="6" w:space="0"/>
+              <w:bottom w:val="single" w:color="000000" w:sz="12" w:space="0"/>
+              <w:right w:val="single" w:color="000000" w:sz="12" w:space="0"/>
+            </w:tcBorders>
+            <w:tcMar>
+              <w:top w:w="30" w:type="dxa"/>
+              <w:left w:w="45" w:type="dxa"/>
+              <w:bottom w:w="30" w:type="dxa"/>
+              <w:right w:w="45" w:type="dxa"/>
+            </w:tcMar>
+            <w:vAlign w:val="center"/>
+          </w:tcPr>
+          <w:p>
+            <w:pPr>
+              <w:pStyle w:val="6"/>
+              <w:rPr>
+                <w:rFonts w:ascii="Century Gothic" w:hAnsi="Century Gothic"/>
+                <w:sz w:val="15"/>
+                <w:szCs w:val="15"/>
+              </w:rPr>
+            </w:pPr>
+          </w:p>
+        </w:tc>
+        <w:tc>
+          <w:tcPr>
+            <w:tcW w:w="0" w:type="auto"/>
+            <w:tcBorders>
+              <w:top w:val="single" w:color="CCCCCC" w:sz="6" w:space="0"/>
+              <w:left w:val="single" w:color="CCCCCC" w:sz="6" w:space="0"/>
+              <w:bottom w:val="single" w:color="000000" w:sz="12" w:space="0"/>
+              <w:right w:val="single" w:color="000000" w:sz="12" w:space="0"/>
+            </w:tcBorders>
+            <w:tcMar>
+              <w:top w:w="30" w:type="dxa"/>
+              <w:left w:w="45" w:type="dxa"/>
+              <w:bottom w:w="30" w:type="dxa"/>
+              <w:right w:w="45" w:type="dxa"/>
+            </w:tcMar>
+            <w:vAlign w:val="center"/>
+          </w:tcPr>
+          <w:p>
+            <w:pPr>
+              <w:pStyle w:val="6"/>
+              <w:rPr>
+                <w:rFonts w:ascii="Century Gothic" w:hAnsi="Century Gothic"/>
+                <w:sz w:val="15"/>
+                <w:szCs w:val="15"/>
+              </w:rPr>
+            </w:pPr>
+          </w:p>
+        </w:tc>
+        <w:tc>
+          <w:tcPr>
+            <w:tcW w:w="0" w:type="auto"/>
+            <w:tcBorders>
+              <w:top w:val="single" w:color="CCCCCC" w:sz="6" w:space="0"/>
+              <w:left w:val="single" w:color="CCCCCC" w:sz="6" w:space="0"/>
+              <w:bottom w:val="single" w:color="000000" w:sz="12" w:space="0"/>
+              <w:right w:val="single" w:color="000000" w:sz="12" w:space="0"/>
+            </w:tcBorders>
+            <w:tcMar>
+              <w:top w:w="30" w:type="dxa"/>
+              <w:left w:w="45" w:type="dxa"/>
+              <w:bottom w:w="30" w:type="dxa"/>
+              <w:right w:w="45" w:type="dxa"/>
+            </w:tcMar>
+            <w:vAlign w:val="center"/>
+          </w:tcPr>
+          <w:p>
+            <w:pPr>
+              <w:pStyle w:val="6"/>
+              <w:rPr>
+                <w:rFonts w:ascii="Century Gothic" w:hAnsi="Century Gothic"/>
+                <w:sz w:val="15"/>
+                <w:szCs w:val="15"/>
+              </w:rPr>
+            </w:pPr>
+          </w:p>
+        </w:tc>
+        <w:tc>
+          <w:tcPr>
+            <w:tcW w:w="0" w:type="auto"/>
+            <w:tcBorders>
+              <w:top w:val="single" w:color="CCCCCC" w:sz="6" w:space="0"/>
+              <w:left w:val="single" w:color="CCCCCC" w:sz="6" w:space="0"/>
+              <w:bottom w:val="single" w:color="000000" w:sz="12" w:space="0"/>
+              <w:right w:val="single" w:color="000000" w:sz="12" w:space="0"/>
+            </w:tcBorders>
+            <w:tcMar>
+              <w:top w:w="30" w:type="dxa"/>
+              <w:left w:w="45" w:type="dxa"/>
+              <w:bottom w:w="30" w:type="dxa"/>
+              <w:right w:w="45" w:type="dxa"/>
+            </w:tcMar>
+            <w:vAlign w:val="center"/>
+          </w:tcPr>
+          <w:p>
+            <w:pPr>
+              <w:pStyle w:val="6"/>
               <w:rPr>
                 <w:rFonts w:ascii="Century Gothic" w:hAnsi="Century Gothic"/>
                 <w:sz w:val="15"/>
@@ -2686,8 +2741,9 @@
     </w:tbl>
     <w:p>
       <w:pPr>
-        <w:pStyle w:val="4"/>
+        <w:pStyle w:val="6"/>
         <w:numPr>
+          <w:ilvl w:val="0"/>
           <w:numId w:val="0"/>
         </w:numPr>
         <w:ind w:leftChars="0"/>
@@ -2700,7 +2756,7 @@
     </w:p>
     <w:p>
       <w:pPr>
-        <w:pStyle w:val="4"/>
+        <w:pStyle w:val="6"/>
         <w:ind w:firstLine="720" w:firstLineChars="0"/>
         <w:rPr>
           <w:rFonts w:cstheme="minorHAnsi"/>
@@ -2734,7 +2790,7 @@
     </w:p>
     <w:p>
       <w:pPr>
-        <w:pStyle w:val="4"/>
+        <w:pStyle w:val="6"/>
         <w:rPr>
           <w:rFonts w:cstheme="minorHAnsi"/>
           <w:b/>
@@ -2746,7 +2802,7 @@
     </w:p>
     <w:p>
       <w:pPr>
-        <w:pStyle w:val="4"/>
+        <w:pStyle w:val="6"/>
         <w:rPr>
           <w:rFonts w:cstheme="minorHAnsi"/>
           <w:b/>
@@ -2768,7 +2824,7 @@
     </w:p>
     <w:p>
       <w:pPr>
-        <w:pStyle w:val="4"/>
+        <w:pStyle w:val="6"/>
         <w:numPr>
           <w:ilvl w:val="0"/>
           <w:numId w:val="1"/>
@@ -2791,7 +2847,7 @@
     </w:p>
     <w:p>
       <w:pPr>
-        <w:pStyle w:val="4"/>
+        <w:pStyle w:val="6"/>
         <w:numPr>
           <w:ilvl w:val="0"/>
           <w:numId w:val="1"/>
@@ -2814,7 +2870,7 @@
     </w:p>
     <w:p>
       <w:pPr>
-        <w:pStyle w:val="4"/>
+        <w:pStyle w:val="6"/>
         <w:numPr>
           <w:ilvl w:val="0"/>
           <w:numId w:val="1"/>
@@ -2842,17 +2898,149 @@
           <w:szCs w:val="15"/>
         </w:rPr>
       </w:pPr>
-    </w:p>
-    <w:p>
-      <w:pPr>
-        <w:jc w:val="both"/>
-        <w:rPr>
-          <w:sz w:val="15"/>
-          <w:szCs w:val="15"/>
-        </w:rPr>
-      </w:pPr>
       <w:bookmarkStart w:id="0" w:name="_GoBack"/>
       <w:bookmarkEnd w:id="0"/>
+    </w:p>
+    <w:p>
+      <w:pPr>
+        <w:ind w:left="5040" w:leftChars="0" w:firstLine="720" w:firstLineChars="0"/>
+        <w:jc w:val="both"/>
+        <w:rPr>
+          <w:sz w:val="15"/>
+          <w:szCs w:val="15"/>
+        </w:rPr>
+      </w:pPr>
+    </w:p>
+    <w:p>
+      <w:pPr>
+        <w:spacing w:line="240" w:lineRule="auto"/>
+        <w:ind w:left="3600" w:leftChars="0" w:firstLine="1015" w:firstLineChars="677"/>
+        <w:jc w:val="both"/>
+        <w:rPr>
+          <w:rFonts w:hint="default"/>
+          <w:b/>
+          <w:bCs/>
+          <w:sz w:val="15"/>
+          <w:szCs w:val="15"/>
+          <w:u w:val="none"/>
+          <w:lang w:val="en-PH"/>
+        </w:rPr>
+      </w:pPr>
+      <w:r>
+        <w:rPr>
+          <w:sz w:val="15"/>
+        </w:rPr>
+        <mc:AlternateContent>
+          <mc:Choice Requires="wps">
+            <w:drawing>
+              <wp:anchor distT="0" distB="0" distL="114300" distR="114300" simplePos="0" relativeHeight="251661312" behindDoc="0" locked="0" layoutInCell="1" allowOverlap="1">
+                <wp:simplePos x="0" y="0"/>
+                <wp:positionH relativeFrom="column">
+                  <wp:posOffset>2713990</wp:posOffset>
+                </wp:positionH>
+                <wp:positionV relativeFrom="paragraph">
+                  <wp:posOffset>152400</wp:posOffset>
+                </wp:positionV>
+                <wp:extent cx="1447165" cy="9525"/>
+                <wp:effectExtent l="0" t="0" r="0" b="0"/>
+                <wp:wrapNone/>
+                <wp:docPr id="1" name="Straight Connector 1"/>
+                <wp:cNvGraphicFramePr/>
+                <a:graphic xmlns:a="http://schemas.openxmlformats.org/drawingml/2006/main">
+                  <a:graphicData uri="http://schemas.microsoft.com/office/word/2010/wordprocessingShape">
+                    <wps:wsp>
+                      <wps:cNvCnPr/>
+                      <wps:spPr>
+                        <a:xfrm>
+                          <a:off x="7134860" y="6151880"/>
+                          <a:ext cx="1447165" cy="9525"/>
+                        </a:xfrm>
+                        <a:prstGeom prst="line">
+                          <a:avLst/>
+                        </a:prstGeom>
+                        <a:ln>
+                          <a:solidFill>
+                            <a:schemeClr val="tx1"/>
+                          </a:solidFill>
+                        </a:ln>
+                      </wps:spPr>
+                      <wps:style>
+                        <a:lnRef idx="2">
+                          <a:schemeClr val="accent1"/>
+                        </a:lnRef>
+                        <a:fillRef idx="0">
+                          <a:srgbClr val="FFFFFF"/>
+                        </a:fillRef>
+                        <a:effectRef idx="0">
+                          <a:srgbClr val="FFFFFF"/>
+                        </a:effectRef>
+                        <a:fontRef idx="minor">
+                          <a:schemeClr val="tx1"/>
+                        </a:fontRef>
+                      </wps:style>
+                      <wps:bodyPr/>
+                    </wps:wsp>
+                  </a:graphicData>
+                </a:graphic>
+              </wp:anchor>
+            </w:drawing>
+          </mc:Choice>
+          <mc:Fallback>
+            <w:pict>
+              <v:line id="_x0000_s1026" o:spid="_x0000_s1026" o:spt="20" style="position:absolute;left:0pt;margin-left:213.7pt;margin-top:12pt;height:0.75pt;width:113.95pt;z-index:251661312;mso-width-relative:page;mso-height-relative:page;" filled="f" stroked="t" coordsize="21600,21600" o:gfxdata="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">
+                <v:fill on="f" focussize="0,0"/>
+                <v:stroke weight="1pt" color="#000000 [3213]" miterlimit="8" joinstyle="miter"/>
+                <v:imagedata o:title=""/>
+                <o:lock v:ext="edit" aspectratio="f"/>
+              </v:line>
+            </w:pict>
+          </mc:Fallback>
+        </mc:AlternateContent>
+      </w:r>
+      <w:r>
+        <w:rPr>
+          <w:rFonts w:hint="default"/>
+          <w:b/>
+          <w:bCs/>
+          <w:sz w:val="15"/>
+          <w:szCs w:val="15"/>
+          <w:u w:val="none"/>
+          <w:lang w:val="en-PH"/>
+        </w:rPr>
+        <w:t>Osas Director/Administrator</w:t>
+      </w:r>
+    </w:p>
+    <w:p>
+      <w:pPr>
+        <w:spacing w:line="240" w:lineRule="auto"/>
+        <w:ind w:left="3600" w:leftChars="0" w:firstLine="1016" w:firstLineChars="677"/>
+        <w:jc w:val="both"/>
+        <w:rPr>
+          <w:rFonts w:hint="default"/>
+          <w:b/>
+          <w:bCs/>
+          <w:i/>
+          <w:iCs/>
+          <w:sz w:val="15"/>
+          <w:szCs w:val="15"/>
+          <w:u w:val="none"/>
+          <w:lang w:val="en-PH"/>
+        </w:rPr>
+      </w:pPr>
+      <w:r>
+        <w:rPr>
+          <w:rFonts w:hint="default"/>
+          <w:b/>
+          <w:bCs/>
+          <w:i/>
+          <w:iCs/>
+          <w:sz w:val="15"/>
+          <w:szCs w:val="15"/>
+          <w:u w:val="none"/>
+          <w:lang w:val="en-PH"/>
+        </w:rPr>
+        <w:t>Signature Over Printed Name</w:t>
+      </w:r>
     </w:p>
     <w:sectPr>
       <w:pgSz w:w="16838" w:h="11906" w:orient="landscape"/>
@@ -3243,6 +3431,39 @@
     </w:tblPr>
   </w:style>
   <w:style w:type="paragraph" w:styleId="4">
+    <w:name w:val="footer"/>
+    <w:basedOn w:val="1"/>
+    <w:uiPriority w:val="0"/>
+    <w:pPr>
+      <w:tabs>
+        <w:tab w:val="center" w:pos="4153"/>
+        <w:tab w:val="right" w:pos="8306"/>
+      </w:tabs>
+      <w:snapToGrid w:val="0"/>
+      <w:jc w:val="left"/>
+    </w:pPr>
+    <w:rPr>
+      <w:sz w:val="18"/>
+      <w:szCs w:val="18"/>
+    </w:rPr>
+  </w:style>
+  <w:style w:type="paragraph" w:styleId="5">
+    <w:name w:val="header"/>
+    <w:basedOn w:val="1"/>
+    <w:uiPriority w:val="0"/>
+    <w:pPr>
+      <w:tabs>
+        <w:tab w:val="center" w:pos="4153"/>
+        <w:tab w:val="right" w:pos="8306"/>
+      </w:tabs>
+      <w:snapToGrid w:val="0"/>
+    </w:pPr>
+    <w:rPr>
+      <w:sz w:val="18"/>
+      <w:szCs w:val="18"/>
+    </w:rPr>
+  </w:style>
+  <w:style w:type="paragraph" w:styleId="6">
     <w:name w:val="No Spacing"/>
     <w:qFormat/>
     <w:uiPriority w:val="1"/>
@@ -3514,4 +3735,21 @@
   </a:themeElements>
   <a:objectDefaults/>
 </a:theme>
+</file>
+
+<file path=customXml/item1.xml><?xml version="1.0" encoding="utf-8"?>
+<s:customData xmlns="http://www.wps.cn/officeDocument/2013/wpsCustomData" xmlns:s="http://www.wps.cn/officeDocument/2013/wpsCustomData">
+  <customSectProps/>
+  <customShpExts>
+    <customShpInfo spid="_x0000_s1026" textRotate="1"/>
+  </customShpExts>
+</s:customData>
+</file>
+
+<file path=customXml/itemProps1.xml><?xml version="1.0" encoding="utf-8"?>
+<ds:datastoreItem xmlns:ds="http://schemas.openxmlformats.org/officeDocument/2006/customXml" ds:itemID="{B1977F7D-205B-4081-913C-38D41E755F92}">
+  <ds:schemaRefs>
+    <ds:schemaRef ds:uri="http://www.wps.cn/officeDocument/2013/wpsCustomData"/>
+  </ds:schemaRefs>
+</ds:datastoreItem>
 </file>
</xml_diff>